<commit_message>
set up attachment for custody complaint PT; make field listing children for affidavit more flexible
</commit_message>
<xml_diff>
--- a/docassemble/MLHDivorceAndCustody/data/templates/complaint_answer_attachment.docx
+++ b/docassemble/MLHDivorceAndCustody/data/templates/complaint_answer_attachment.docx
@@ -143,7 +143,47 @@
         <w:rPr>
           <w:rFonts w:ascii="Arial" w:hAnsi="Arial" w:cs="Arial"/>
         </w:rPr>
-        <w:t xml:space="preserve">)) and </w:t>
+        <w:t>)</w:t>
+      </w:r>
+      <w:r>
+        <w:rPr>
+          <w:rFonts w:ascii="Arial" w:hAnsi="Arial" w:cs="Arial"/>
+        </w:rPr>
+        <w:t xml:space="preserve"> or </w:t>
+      </w:r>
+      <w:proofErr w:type="spellStart"/>
+      <w:r>
+        <w:rPr>
+          <w:rFonts w:ascii="Arial" w:hAnsi="Arial" w:cs="Arial"/>
+        </w:rPr>
+        <w:t>tool_ID</w:t>
+      </w:r>
+      <w:proofErr w:type="spellEnd"/>
+      <w:r>
+        <w:rPr>
+          <w:rFonts w:ascii="Arial" w:hAnsi="Arial" w:cs="Arial"/>
+        </w:rPr>
+        <w:t xml:space="preserve"> == “</w:t>
+      </w:r>
+      <w:proofErr w:type="spellStart"/>
+      <w:r>
+        <w:rPr>
+          <w:rFonts w:ascii="Arial" w:hAnsi="Arial" w:cs="Arial"/>
+        </w:rPr>
+        <w:t>custody_complaint</w:t>
+      </w:r>
+      <w:proofErr w:type="spellEnd"/>
+      <w:r>
+        <w:rPr>
+          <w:rFonts w:ascii="Arial" w:hAnsi="Arial" w:cs="Arial"/>
+        </w:rPr>
+        <w:t>”</w:t>
+      </w:r>
+      <w:r>
+        <w:rPr>
+          <w:rFonts w:ascii="Arial" w:hAnsi="Arial" w:cs="Arial"/>
+        </w:rPr>
+        <w:t xml:space="preserve">) and </w:t>
       </w:r>
       <w:proofErr w:type="spellStart"/>
       <w:r>
@@ -193,16 +233,94 @@
       <w:r>
         <w:rPr>
           <w:rFonts w:ascii="Arial" w:hAnsi="Arial" w:cs="Arial"/>
+        </w:rPr>
+        <w:t xml:space="preserve">{% if </w:t>
+      </w:r>
+      <w:proofErr w:type="spellStart"/>
+      <w:r>
+        <w:rPr>
+          <w:rFonts w:ascii="Arial" w:hAnsi="Arial" w:cs="Arial"/>
+        </w:rPr>
+        <w:t>tool_ID</w:t>
+      </w:r>
+      <w:proofErr w:type="spellEnd"/>
+      <w:r>
+        <w:rPr>
+          <w:rFonts w:ascii="Arial" w:hAnsi="Arial" w:cs="Arial"/>
+        </w:rPr>
+        <w:t xml:space="preserve"> </w:t>
+      </w:r>
+      <w:r>
+        <w:rPr>
+          <w:rFonts w:ascii="Arial" w:hAnsi="Arial" w:cs="Arial"/>
+        </w:rPr>
+        <w:t>in</w:t>
+      </w:r>
+      <w:r>
+        <w:rPr>
+          <w:rFonts w:ascii="Arial" w:hAnsi="Arial" w:cs="Arial"/>
+        </w:rPr>
+        <w:t xml:space="preserve"> </w:t>
+      </w:r>
+      <w:r>
+        <w:rPr>
+          <w:rFonts w:ascii="Arial" w:hAnsi="Arial" w:cs="Arial"/>
+        </w:rPr>
+        <w:t>[</w:t>
+      </w:r>
+      <w:r>
+        <w:rPr>
+          <w:rFonts w:ascii="Arial" w:hAnsi="Arial" w:cs="Arial"/>
+        </w:rPr>
+        <w:t>“</w:t>
+      </w:r>
+      <w:proofErr w:type="spellStart"/>
+      <w:r>
+        <w:rPr>
+          <w:rFonts w:ascii="Arial" w:hAnsi="Arial" w:cs="Arial"/>
+        </w:rPr>
+        <w:t>divorce_answer</w:t>
+      </w:r>
+      <w:proofErr w:type="spellEnd"/>
+      <w:r>
+        <w:rPr>
+          <w:rFonts w:ascii="Arial" w:hAnsi="Arial" w:cs="Arial"/>
+        </w:rPr>
+        <w:t>”</w:t>
+      </w:r>
+      <w:r>
+        <w:rPr>
+          <w:rFonts w:ascii="Arial" w:hAnsi="Arial" w:cs="Arial"/>
+        </w:rPr>
+        <w:t>, “</w:t>
+      </w:r>
+      <w:proofErr w:type="spellStart"/>
+      <w:r>
+        <w:rPr>
+          <w:rFonts w:ascii="Arial" w:hAnsi="Arial" w:cs="Arial"/>
+        </w:rPr>
+        <w:t>divorce_complaint</w:t>
+      </w:r>
+      <w:proofErr w:type="spellEnd"/>
+      <w:r>
+        <w:rPr>
+          <w:rFonts w:ascii="Arial" w:hAnsi="Arial" w:cs="Arial"/>
+        </w:rPr>
+        <w:t>”]</w:t>
+      </w:r>
+      <w:r>
+        <w:rPr>
+          <w:rFonts w:ascii="Arial" w:hAnsi="Arial" w:cs="Arial"/>
+        </w:rPr>
+        <w:t xml:space="preserve"> %}</w:t>
+      </w:r>
+      <w:r>
+        <w:rPr>
+          <w:rFonts w:ascii="Arial" w:hAnsi="Arial" w:cs="Arial"/>
           <w:b/>
           <w:bCs/>
         </w:rPr>
-        <w:t>10)</w:t>
-      </w:r>
-      <w:r>
-        <w:rPr>
-          <w:rFonts w:ascii="Arial" w:hAnsi="Arial" w:cs="Arial"/>
-        </w:rPr>
-        <w:t xml:space="preserve"> </w:t>
+        <w:t>1</w:t>
       </w:r>
       <w:r>
         <w:rPr>
@@ -210,259 +328,75 @@
           <w:b/>
           <w:bCs/>
         </w:rPr>
-        <w:t>Parenting Time:</w:t>
-      </w:r>
-    </w:p>
-    <w:p>
-      <w:pPr>
-        <w:spacing w:after="0" w:line="240" w:lineRule="auto"/>
-        <w:rPr>
-          <w:rFonts w:ascii="Arial" w:hAnsi="Arial" w:cs="Arial"/>
-        </w:rPr>
-      </w:pPr>
-      <w:r>
-        <w:rPr>
-          <w:rFonts w:ascii="Arial" w:hAnsi="Arial" w:cs="Arial"/>
-        </w:rPr>
-        <w:t>{% if PT_type == “supervised” %}</w:t>
-      </w:r>
-      <w:r>
-        <w:rPr>
-          <w:rFonts w:ascii="Arial" w:hAnsi="Arial" w:cs="Arial"/>
-        </w:rPr>
-        <w:t xml:space="preserve">Parenting time will be supervised by </w:t>
-      </w:r>
-      <w:r>
-        <w:rPr>
-          <w:rFonts w:ascii="Arial" w:hAnsi="Arial" w:cs="Arial"/>
-        </w:rPr>
-        <w:t>{{</w:t>
-      </w:r>
-      <w:r>
-        <w:rPr>
-          <w:rFonts w:ascii="Arial" w:hAnsi="Arial" w:cs="Arial"/>
-        </w:rPr>
-        <w:t xml:space="preserve"> PT_supervisor </w:t>
-      </w:r>
-      <w:r>
-        <w:rPr>
-          <w:rFonts w:ascii="Arial" w:hAnsi="Arial" w:cs="Arial"/>
-        </w:rPr>
-        <w:t>}}</w:t>
-      </w:r>
-      <w:r>
-        <w:rPr>
-          <w:rFonts w:ascii="Arial" w:hAnsi="Arial" w:cs="Arial"/>
-        </w:rPr>
-        <w:t xml:space="preserve">. </w:t>
-      </w:r>
-      <w:r>
-        <w:rPr>
-          <w:rFonts w:ascii="Arial" w:hAnsi="Arial" w:cs="Arial"/>
-        </w:rPr>
-        <w:t>{% endif %}</w:t>
-      </w:r>
-      <w:r>
-        <w:rPr>
-          <w:rFonts w:ascii="Arial" w:hAnsi="Arial" w:cs="Arial"/>
-        </w:rPr>
-        <w:t xml:space="preserve">{{ </w:t>
-      </w:r>
-      <w:r>
-        <w:rPr>
-          <w:rFonts w:ascii="Arial" w:hAnsi="Arial" w:cs="Arial"/>
-        </w:rPr>
-        <w:t>custom_PT_details</w:t>
-      </w:r>
-      <w:r>
-        <w:rPr>
-          <w:rFonts w:ascii="Arial" w:hAnsi="Arial" w:cs="Arial"/>
-        </w:rPr>
-        <w:t xml:space="preserve"> }}</w:t>
-      </w:r>
-    </w:p>
-    <w:p>
-      <w:pPr>
-        <w:spacing w:after="0" w:line="240" w:lineRule="auto"/>
-        <w:rPr>
-          <w:rFonts w:ascii="Arial" w:hAnsi="Arial" w:cs="Arial"/>
-        </w:rPr>
-      </w:pPr>
-    </w:p>
-    <w:p>
-      <w:pPr>
-        <w:spacing w:after="0" w:line="240" w:lineRule="auto"/>
-        <w:rPr>
-          <w:rFonts w:ascii="Arial" w:hAnsi="Arial" w:cs="Arial"/>
-        </w:rPr>
-      </w:pPr>
-      <w:r>
-        <w:rPr>
-          <w:rFonts w:ascii="Arial" w:hAnsi="Arial" w:cs="Arial"/>
-        </w:rPr>
-        <w:t>{%p endif %}</w:t>
-      </w:r>
-    </w:p>
-    <w:p>
-      <w:pPr>
-        <w:spacing w:after="0" w:line="240" w:lineRule="auto"/>
-        <w:rPr>
-          <w:rFonts w:ascii="Arial" w:hAnsi="Arial" w:cs="Arial"/>
-        </w:rPr>
-      </w:pPr>
-      <w:r>
-        <w:rPr>
-          <w:rFonts w:ascii="Arial" w:hAnsi="Arial" w:cs="Arial"/>
-        </w:rPr>
-        <w:t xml:space="preserve">{%p if </w:t>
-      </w:r>
-      <w:proofErr w:type="spellStart"/>
-      <w:r>
-        <w:rPr>
-          <w:rFonts w:ascii="Arial" w:hAnsi="Arial" w:cs="Arial"/>
-        </w:rPr>
-        <w:t>user_wants_post_divorce_support</w:t>
-      </w:r>
-      <w:proofErr w:type="spellEnd"/>
-      <w:r>
-        <w:rPr>
-          <w:rFonts w:ascii="Arial" w:hAnsi="Arial" w:cs="Arial"/>
-        </w:rPr>
-        <w:t xml:space="preserve"> %}</w:t>
-      </w:r>
-    </w:p>
-    <w:p>
-      <w:pPr>
-        <w:rPr>
-          <w:rFonts w:ascii="Arial" w:hAnsi="Arial" w:cs="Arial"/>
-        </w:rPr>
-      </w:pPr>
+        <w:t>0</w:t>
+      </w:r>
+      <w:r>
+        <w:rPr>
+          <w:rFonts w:ascii="Arial" w:hAnsi="Arial" w:cs="Arial"/>
+        </w:rPr>
+        <w:t xml:space="preserve">{% </w:t>
+      </w:r>
+      <w:proofErr w:type="spellStart"/>
+      <w:r>
+        <w:rPr>
+          <w:rFonts w:ascii="Arial" w:hAnsi="Arial" w:cs="Arial"/>
+        </w:rPr>
+        <w:t>elif</w:t>
+      </w:r>
+      <w:proofErr w:type="spellEnd"/>
+      <w:r>
+        <w:rPr>
+          <w:rFonts w:ascii="Arial" w:hAnsi="Arial" w:cs="Arial"/>
+        </w:rPr>
+        <w:t xml:space="preserve"> </w:t>
+      </w:r>
+      <w:proofErr w:type="spellStart"/>
+      <w:r>
+        <w:rPr>
+          <w:rFonts w:ascii="Arial" w:hAnsi="Arial" w:cs="Arial"/>
+        </w:rPr>
+        <w:t>tool_ID</w:t>
+      </w:r>
+      <w:proofErr w:type="spellEnd"/>
+      <w:r>
+        <w:rPr>
+          <w:rFonts w:ascii="Arial" w:hAnsi="Arial" w:cs="Arial"/>
+        </w:rPr>
+        <w:t xml:space="preserve"> == “</w:t>
+      </w:r>
+      <w:proofErr w:type="spellStart"/>
+      <w:r>
+        <w:rPr>
+          <w:rFonts w:ascii="Arial" w:hAnsi="Arial" w:cs="Arial"/>
+        </w:rPr>
+        <w:t>custody</w:t>
+      </w:r>
+      <w:r>
+        <w:rPr>
+          <w:rFonts w:ascii="Arial" w:hAnsi="Arial" w:cs="Arial"/>
+        </w:rPr>
+        <w:t>_complaint</w:t>
+      </w:r>
+      <w:proofErr w:type="spellEnd"/>
+      <w:r>
+        <w:rPr>
+          <w:rFonts w:ascii="Arial" w:hAnsi="Arial" w:cs="Arial"/>
+        </w:rPr>
+        <w:t>” %}</w:t>
+      </w:r>
       <w:r>
         <w:rPr>
           <w:rFonts w:ascii="Arial" w:hAnsi="Arial" w:cs="Arial"/>
           <w:b/>
           <w:bCs/>
         </w:rPr>
-        <w:t>(</w:t>
-      </w:r>
-      <w:r>
-        <w:rPr>
-          <w:rFonts w:ascii="Arial" w:hAnsi="Arial" w:cs="Arial"/>
-          <w:highlight w:val="yellow"/>
-        </w:rPr>
-        <w:t xml:space="preserve">{% if </w:t>
-      </w:r>
-      <w:proofErr w:type="spellStart"/>
-      <w:r>
-        <w:rPr>
-          <w:rFonts w:ascii="Arial" w:hAnsi="Arial" w:cs="Arial"/>
-          <w:highlight w:val="yellow"/>
-        </w:rPr>
-        <w:t>there_</w:t>
-      </w:r>
-      <w:r>
-        <w:rPr>
-          <w:rFonts w:ascii="Arial" w:hAnsi="Arial" w:cs="Arial"/>
-          <w:highlight w:val="yellow"/>
-        </w:rPr>
-        <w:t>are</w:t>
-      </w:r>
-      <w:r>
-        <w:rPr>
-          <w:rFonts w:ascii="Arial" w:hAnsi="Arial" w:cs="Arial"/>
-          <w:highlight w:val="yellow"/>
-        </w:rPr>
-        <w:t>_marital_children</w:t>
-      </w:r>
-      <w:proofErr w:type="spellEnd"/>
-      <w:r>
-        <w:rPr>
-          <w:rFonts w:ascii="Arial" w:hAnsi="Arial" w:cs="Arial"/>
-          <w:highlight w:val="yellow"/>
-        </w:rPr>
-        <w:t xml:space="preserve"> </w:t>
-      </w:r>
-      <w:r>
-        <w:rPr>
-          <w:rFonts w:ascii="Arial" w:hAnsi="Arial" w:cs="Arial"/>
-          <w:highlight w:val="yellow"/>
-        </w:rPr>
-        <w:t xml:space="preserve">or </w:t>
-      </w:r>
-      <w:r>
-        <w:rPr>
-          <w:rFonts w:ascii="Arial" w:hAnsi="Arial" w:cs="Arial"/>
-        </w:rPr>
-        <w:t>(</w:t>
-      </w:r>
-      <w:proofErr w:type="spellStart"/>
-      <w:r>
-        <w:rPr>
-          <w:rFonts w:ascii="Arial" w:hAnsi="Arial" w:cs="Arial"/>
-        </w:rPr>
-        <w:t>tool_ID</w:t>
-      </w:r>
-      <w:proofErr w:type="spellEnd"/>
-      <w:r>
-        <w:rPr>
-          <w:rFonts w:ascii="Arial" w:hAnsi="Arial" w:cs="Arial"/>
-        </w:rPr>
-        <w:t xml:space="preserve"> == “</w:t>
-      </w:r>
-      <w:proofErr w:type="spellStart"/>
-      <w:r>
-        <w:rPr>
-          <w:rFonts w:ascii="Arial" w:hAnsi="Arial" w:cs="Arial"/>
-        </w:rPr>
-        <w:t>divorce_answer</w:t>
-      </w:r>
-      <w:proofErr w:type="spellEnd"/>
-      <w:r>
-        <w:rPr>
-          <w:rFonts w:ascii="Arial" w:hAnsi="Arial" w:cs="Arial"/>
-        </w:rPr>
-        <w:t xml:space="preserve">” and </w:t>
-      </w:r>
-      <w:proofErr w:type="spellStart"/>
-      <w:r>
-        <w:rPr>
-          <w:rFonts w:ascii="Arial" w:hAnsi="Arial" w:cs="Arial"/>
-        </w:rPr>
-        <w:t>counterclaim_type</w:t>
-      </w:r>
-      <w:proofErr w:type="spellEnd"/>
-      <w:r>
-        <w:rPr>
-          <w:rFonts w:ascii="Arial" w:hAnsi="Arial" w:cs="Arial"/>
-        </w:rPr>
-        <w:t xml:space="preserve"> == “</w:t>
-      </w:r>
-      <w:proofErr w:type="spellStart"/>
-      <w:r>
-        <w:rPr>
-          <w:rFonts w:ascii="Arial" w:hAnsi="Arial" w:cs="Arial"/>
-        </w:rPr>
-        <w:t>with_children</w:t>
-      </w:r>
-      <w:proofErr w:type="spellEnd"/>
-      <w:r>
-        <w:rPr>
-          <w:rFonts w:ascii="Arial" w:hAnsi="Arial" w:cs="Arial"/>
-        </w:rPr>
-        <w:t>”</w:t>
-      </w:r>
-      <w:r>
-        <w:rPr>
-          <w:rFonts w:ascii="Arial" w:hAnsi="Arial" w:cs="Arial"/>
-        </w:rPr>
-        <w:t xml:space="preserve">) </w:t>
-      </w:r>
-      <w:r>
-        <w:rPr>
-          <w:rFonts w:ascii="Arial" w:hAnsi="Arial" w:cs="Arial"/>
-          <w:highlight w:val="yellow"/>
-        </w:rPr>
-        <w:t>%}</w:t>
+        <w:t>9</w:t>
+      </w:r>
+      <w:r>
+        <w:rPr>
+          <w:rFonts w:ascii="Arial" w:hAnsi="Arial" w:cs="Arial"/>
+        </w:rPr>
+        <w:t>{% endif %}</w:t>
       </w:r>
       <w:r>
         <w:rPr>
@@ -470,76 +404,13 @@
           <w:b/>
           <w:bCs/>
         </w:rPr>
-        <w:t>13</w:t>
-      </w:r>
-      <w:r>
-        <w:rPr>
-          <w:rFonts w:ascii="Arial" w:hAnsi="Arial" w:cs="Arial"/>
-          <w:highlight w:val="yellow"/>
-        </w:rPr>
-        <w:t xml:space="preserve">{% </w:t>
-      </w:r>
-      <w:proofErr w:type="spellStart"/>
-      <w:r>
-        <w:rPr>
-          <w:rFonts w:ascii="Arial" w:hAnsi="Arial" w:cs="Arial"/>
-          <w:highlight w:val="yellow"/>
-        </w:rPr>
-        <w:t>el</w:t>
-      </w:r>
-      <w:r>
-        <w:rPr>
-          <w:rFonts w:ascii="Arial" w:hAnsi="Arial" w:cs="Arial"/>
-          <w:highlight w:val="yellow"/>
-        </w:rPr>
-        <w:t>if</w:t>
-      </w:r>
-      <w:proofErr w:type="spellEnd"/>
-      <w:r>
-        <w:rPr>
-          <w:rFonts w:ascii="Arial" w:hAnsi="Arial" w:cs="Arial"/>
-          <w:highlight w:val="yellow"/>
+        <w:t>)</w:t>
+      </w:r>
+      <w:r>
+        <w:rPr>
+          <w:rFonts w:ascii="Arial" w:hAnsi="Arial" w:cs="Arial"/>
         </w:rPr>
         <w:t xml:space="preserve"> </w:t>
-      </w:r>
-      <w:proofErr w:type="spellStart"/>
-      <w:r>
-        <w:rPr>
-          <w:rFonts w:ascii="Arial" w:hAnsi="Arial" w:cs="Arial"/>
-          <w:highlight w:val="yellow"/>
-        </w:rPr>
-        <w:t>tool_ID</w:t>
-      </w:r>
-      <w:proofErr w:type="spellEnd"/>
-      <w:r>
-        <w:rPr>
-          <w:rFonts w:ascii="Arial" w:hAnsi="Arial" w:cs="Arial"/>
-          <w:highlight w:val="yellow"/>
-        </w:rPr>
-        <w:t xml:space="preserve"> == “</w:t>
-      </w:r>
-      <w:proofErr w:type="spellStart"/>
-      <w:r>
-        <w:rPr>
-          <w:rFonts w:ascii="Arial" w:hAnsi="Arial" w:cs="Arial"/>
-          <w:highlight w:val="yellow"/>
-        </w:rPr>
-        <w:t>divorce_complaint</w:t>
-      </w:r>
-      <w:proofErr w:type="spellEnd"/>
-      <w:r>
-        <w:rPr>
-          <w:rFonts w:ascii="Arial" w:hAnsi="Arial" w:cs="Arial"/>
-          <w:highlight w:val="yellow"/>
-        </w:rPr>
-        <w:t>”</w:t>
-      </w:r>
-      <w:r>
-        <w:rPr>
-          <w:rFonts w:ascii="Arial" w:hAnsi="Arial" w:cs="Arial"/>
-          <w:highlight w:val="yellow"/>
-        </w:rPr>
-        <w:t xml:space="preserve"> %}</w:t>
       </w:r>
       <w:r>
         <w:rPr>
@@ -547,43 +418,367 @@
           <w:b/>
           <w:bCs/>
         </w:rPr>
-        <w:t>8</w:t>
-      </w:r>
-      <w:r>
-        <w:rPr>
-          <w:rFonts w:ascii="Arial" w:hAnsi="Arial" w:cs="Arial"/>
-          <w:highlight w:val="yellow"/>
-        </w:rPr>
-        <w:t>{% el</w:t>
-      </w:r>
-      <w:r>
-        <w:rPr>
-          <w:rFonts w:ascii="Arial" w:hAnsi="Arial" w:cs="Arial"/>
-          <w:highlight w:val="yellow"/>
-        </w:rPr>
-        <w:t xml:space="preserve">se </w:t>
-      </w:r>
-      <w:r>
-        <w:rPr>
-          <w:rFonts w:ascii="Arial" w:hAnsi="Arial" w:cs="Arial"/>
-          <w:highlight w:val="yellow"/>
+        <w:t>Parenting Time:</w:t>
+      </w:r>
+    </w:p>
+    <w:p>
+      <w:pPr>
+        <w:spacing w:after="0" w:line="240" w:lineRule="auto"/>
+        <w:rPr>
+          <w:rFonts w:ascii="Arial" w:hAnsi="Arial" w:cs="Arial"/>
+        </w:rPr>
+      </w:pPr>
+      <w:r>
+        <w:rPr>
+          <w:rFonts w:ascii="Arial" w:hAnsi="Arial" w:cs="Arial"/>
+        </w:rPr>
+        <w:t xml:space="preserve">{% if PT_type == “supervised” </w:t>
+      </w:r>
+      <w:proofErr w:type="gramStart"/>
+      <w:r>
+        <w:rPr>
+          <w:rFonts w:ascii="Arial" w:hAnsi="Arial" w:cs="Arial"/>
         </w:rPr>
         <w:t>%}</w:t>
       </w:r>
+      <w:r>
+        <w:rPr>
+          <w:rFonts w:ascii="Arial" w:hAnsi="Arial" w:cs="Arial"/>
+        </w:rPr>
+        <w:t>Parenting</w:t>
+      </w:r>
+      <w:proofErr w:type="gramEnd"/>
+      <w:r>
+        <w:rPr>
+          <w:rFonts w:ascii="Arial" w:hAnsi="Arial" w:cs="Arial"/>
+        </w:rPr>
+        <w:t xml:space="preserve"> time will be supervised by </w:t>
+      </w:r>
+      <w:proofErr w:type="gramStart"/>
+      <w:r>
+        <w:rPr>
+          <w:rFonts w:ascii="Arial" w:hAnsi="Arial" w:cs="Arial"/>
+        </w:rPr>
+        <w:t>{{</w:t>
+      </w:r>
+      <w:r>
+        <w:rPr>
+          <w:rFonts w:ascii="Arial" w:hAnsi="Arial" w:cs="Arial"/>
+        </w:rPr>
+        <w:t xml:space="preserve"> PT</w:t>
+      </w:r>
+      <w:proofErr w:type="gramEnd"/>
+      <w:r>
+        <w:rPr>
+          <w:rFonts w:ascii="Arial" w:hAnsi="Arial" w:cs="Arial"/>
+        </w:rPr>
+        <w:t>_</w:t>
+      </w:r>
+      <w:proofErr w:type="gramStart"/>
+      <w:r>
+        <w:rPr>
+          <w:rFonts w:ascii="Arial" w:hAnsi="Arial" w:cs="Arial"/>
+        </w:rPr>
+        <w:t xml:space="preserve">supervisor </w:t>
+      </w:r>
+      <w:r>
+        <w:rPr>
+          <w:rFonts w:ascii="Arial" w:hAnsi="Arial" w:cs="Arial"/>
+        </w:rPr>
+        <w:t>}</w:t>
+      </w:r>
+      <w:proofErr w:type="gramEnd"/>
+      <w:r>
+        <w:rPr>
+          <w:rFonts w:ascii="Arial" w:hAnsi="Arial" w:cs="Arial"/>
+        </w:rPr>
+        <w:t>}</w:t>
+      </w:r>
+      <w:r>
+        <w:rPr>
+          <w:rFonts w:ascii="Arial" w:hAnsi="Arial" w:cs="Arial"/>
+        </w:rPr>
+        <w:t xml:space="preserve">. </w:t>
+      </w:r>
+      <w:r>
+        <w:rPr>
+          <w:rFonts w:ascii="Arial" w:hAnsi="Arial" w:cs="Arial"/>
+        </w:rPr>
+        <w:t xml:space="preserve">{% endif </w:t>
+      </w:r>
+      <w:proofErr w:type="gramStart"/>
+      <w:r>
+        <w:rPr>
+          <w:rFonts w:ascii="Arial" w:hAnsi="Arial" w:cs="Arial"/>
+        </w:rPr>
+        <w:t>%}</w:t>
+      </w:r>
+      <w:r>
+        <w:rPr>
+          <w:rFonts w:ascii="Arial" w:hAnsi="Arial" w:cs="Arial"/>
+        </w:rPr>
+        <w:t xml:space="preserve">{{ </w:t>
+      </w:r>
+      <w:r>
+        <w:rPr>
+          <w:rFonts w:ascii="Arial" w:hAnsi="Arial" w:cs="Arial"/>
+        </w:rPr>
+        <w:t>custom</w:t>
+      </w:r>
+      <w:proofErr w:type="gramEnd"/>
+      <w:r>
+        <w:rPr>
+          <w:rFonts w:ascii="Arial" w:hAnsi="Arial" w:cs="Arial"/>
+        </w:rPr>
+        <w:t>_PT_</w:t>
+      </w:r>
+      <w:proofErr w:type="gramStart"/>
+      <w:r>
+        <w:rPr>
+          <w:rFonts w:ascii="Arial" w:hAnsi="Arial" w:cs="Arial"/>
+        </w:rPr>
+        <w:t>details</w:t>
+      </w:r>
+      <w:r>
+        <w:rPr>
+          <w:rFonts w:ascii="Arial" w:hAnsi="Arial" w:cs="Arial"/>
+        </w:rPr>
+        <w:t xml:space="preserve"> }</w:t>
+      </w:r>
+      <w:proofErr w:type="gramEnd"/>
+      <w:r>
+        <w:rPr>
+          <w:rFonts w:ascii="Arial" w:hAnsi="Arial" w:cs="Arial"/>
+        </w:rPr>
+        <w:t>}</w:t>
+      </w:r>
+    </w:p>
+    <w:p>
+      <w:pPr>
+        <w:spacing w:after="0" w:line="240" w:lineRule="auto"/>
+        <w:rPr>
+          <w:rFonts w:ascii="Arial" w:hAnsi="Arial" w:cs="Arial"/>
+        </w:rPr>
+      </w:pPr>
+    </w:p>
+    <w:p>
+      <w:pPr>
+        <w:spacing w:after="0" w:line="240" w:lineRule="auto"/>
+        <w:rPr>
+          <w:rFonts w:ascii="Arial" w:hAnsi="Arial" w:cs="Arial"/>
+        </w:rPr>
+      </w:pPr>
+      <w:r>
+        <w:rPr>
+          <w:rFonts w:ascii="Arial" w:hAnsi="Arial" w:cs="Arial"/>
+        </w:rPr>
+        <w:t xml:space="preserve">{%p </w:t>
+      </w:r>
+      <w:proofErr w:type="gramStart"/>
+      <w:r>
+        <w:rPr>
+          <w:rFonts w:ascii="Arial" w:hAnsi="Arial" w:cs="Arial"/>
+        </w:rPr>
+        <w:t>endif %}</w:t>
+      </w:r>
+      <w:proofErr w:type="gramEnd"/>
+    </w:p>
+    <w:p>
+      <w:pPr>
+        <w:spacing w:after="0" w:line="240" w:lineRule="auto"/>
+        <w:rPr>
+          <w:rFonts w:ascii="Arial" w:hAnsi="Arial" w:cs="Arial"/>
+        </w:rPr>
+      </w:pPr>
+      <w:r>
+        <w:rPr>
+          <w:rFonts w:ascii="Arial" w:hAnsi="Arial" w:cs="Arial"/>
+        </w:rPr>
+        <w:t xml:space="preserve">{%p if </w:t>
+      </w:r>
+      <w:proofErr w:type="spellStart"/>
+      <w:r>
+        <w:rPr>
+          <w:rFonts w:ascii="Arial" w:hAnsi="Arial" w:cs="Arial"/>
+        </w:rPr>
+        <w:t>tool_ID</w:t>
+      </w:r>
+      <w:proofErr w:type="spellEnd"/>
+      <w:r>
+        <w:rPr>
+          <w:rFonts w:ascii="Arial" w:hAnsi="Arial" w:cs="Arial"/>
+        </w:rPr>
+        <w:t xml:space="preserve"> in [“</w:t>
+      </w:r>
+      <w:proofErr w:type="spellStart"/>
+      <w:r>
+        <w:rPr>
+          <w:rFonts w:ascii="Arial" w:hAnsi="Arial" w:cs="Arial"/>
+        </w:rPr>
+        <w:t>divorce_complaint</w:t>
+      </w:r>
+      <w:proofErr w:type="spellEnd"/>
+      <w:r>
+        <w:rPr>
+          <w:rFonts w:ascii="Arial" w:hAnsi="Arial" w:cs="Arial"/>
+        </w:rPr>
+        <w:t>”, “</w:t>
+      </w:r>
+      <w:proofErr w:type="spellStart"/>
+      <w:r>
+        <w:rPr>
+          <w:rFonts w:ascii="Arial" w:hAnsi="Arial" w:cs="Arial"/>
+        </w:rPr>
+        <w:t>divorce_answer</w:t>
+      </w:r>
+      <w:proofErr w:type="spellEnd"/>
+      <w:r>
+        <w:rPr>
+          <w:rFonts w:ascii="Arial" w:hAnsi="Arial" w:cs="Arial"/>
+        </w:rPr>
+        <w:t xml:space="preserve">”] and </w:t>
+      </w:r>
+      <w:proofErr w:type="spellStart"/>
+      <w:r>
+        <w:rPr>
+          <w:rFonts w:ascii="Arial" w:hAnsi="Arial" w:cs="Arial"/>
+        </w:rPr>
+        <w:t>user_wants_post_divorce_support</w:t>
+      </w:r>
+      <w:proofErr w:type="spellEnd"/>
+      <w:r>
+        <w:rPr>
+          <w:rFonts w:ascii="Arial" w:hAnsi="Arial" w:cs="Arial"/>
+        </w:rPr>
+        <w:t xml:space="preserve"> %}</w:t>
+      </w:r>
+    </w:p>
+    <w:p>
+      <w:pPr>
+        <w:rPr>
+          <w:rFonts w:ascii="Arial" w:hAnsi="Arial" w:cs="Arial"/>
+        </w:rPr>
+      </w:pPr>
       <w:r>
         <w:rPr>
           <w:rFonts w:ascii="Arial" w:hAnsi="Arial" w:cs="Arial"/>
           <w:b/>
           <w:bCs/>
         </w:rPr>
-        <w:t>9</w:t>
-      </w:r>
-      <w:r>
-        <w:rPr>
-          <w:rFonts w:ascii="Arial" w:hAnsi="Arial" w:cs="Arial"/>
-          <w:highlight w:val="yellow"/>
-        </w:rPr>
-        <w:t>{% endif %}</w:t>
+        <w:t>(</w:t>
+      </w:r>
+      <w:r>
+        <w:rPr>
+          <w:rFonts w:ascii="Arial" w:hAnsi="Arial" w:cs="Arial"/>
+          <w:highlight w:val="yellow"/>
+        </w:rPr>
+        <w:t xml:space="preserve">{% if </w:t>
+      </w:r>
+      <w:proofErr w:type="spellStart"/>
+      <w:r>
+        <w:rPr>
+          <w:rFonts w:ascii="Arial" w:hAnsi="Arial" w:cs="Arial"/>
+          <w:highlight w:val="yellow"/>
+        </w:rPr>
+        <w:t>there_</w:t>
+      </w:r>
+      <w:r>
+        <w:rPr>
+          <w:rFonts w:ascii="Arial" w:hAnsi="Arial" w:cs="Arial"/>
+          <w:highlight w:val="yellow"/>
+        </w:rPr>
+        <w:t>are</w:t>
+      </w:r>
+      <w:r>
+        <w:rPr>
+          <w:rFonts w:ascii="Arial" w:hAnsi="Arial" w:cs="Arial"/>
+          <w:highlight w:val="yellow"/>
+        </w:rPr>
+        <w:t>_marital_children</w:t>
+      </w:r>
+      <w:proofErr w:type="spellEnd"/>
+      <w:r>
+        <w:rPr>
+          <w:rFonts w:ascii="Arial" w:hAnsi="Arial" w:cs="Arial"/>
+          <w:highlight w:val="yellow"/>
+        </w:rPr>
+        <w:t xml:space="preserve"> </w:t>
+      </w:r>
+      <w:r>
+        <w:rPr>
+          <w:rFonts w:ascii="Arial" w:hAnsi="Arial" w:cs="Arial"/>
+          <w:highlight w:val="yellow"/>
+        </w:rPr>
+        <w:t xml:space="preserve">or </w:t>
+      </w:r>
+      <w:r>
+        <w:rPr>
+          <w:rFonts w:ascii="Arial" w:hAnsi="Arial" w:cs="Arial"/>
+        </w:rPr>
+        <w:t>(</w:t>
+      </w:r>
+      <w:proofErr w:type="spellStart"/>
+      <w:r>
+        <w:rPr>
+          <w:rFonts w:ascii="Arial" w:hAnsi="Arial" w:cs="Arial"/>
+        </w:rPr>
+        <w:t>tool_ID</w:t>
+      </w:r>
+      <w:proofErr w:type="spellEnd"/>
+      <w:r>
+        <w:rPr>
+          <w:rFonts w:ascii="Arial" w:hAnsi="Arial" w:cs="Arial"/>
+        </w:rPr>
+        <w:t xml:space="preserve"> == “</w:t>
+      </w:r>
+      <w:proofErr w:type="spellStart"/>
+      <w:r>
+        <w:rPr>
+          <w:rFonts w:ascii="Arial" w:hAnsi="Arial" w:cs="Arial"/>
+        </w:rPr>
+        <w:t>divorce_answer</w:t>
+      </w:r>
+      <w:proofErr w:type="spellEnd"/>
+      <w:r>
+        <w:rPr>
+          <w:rFonts w:ascii="Arial" w:hAnsi="Arial" w:cs="Arial"/>
+        </w:rPr>
+        <w:t xml:space="preserve">” and </w:t>
+      </w:r>
+      <w:proofErr w:type="spellStart"/>
+      <w:r>
+        <w:rPr>
+          <w:rFonts w:ascii="Arial" w:hAnsi="Arial" w:cs="Arial"/>
+        </w:rPr>
+        <w:t>counterclaim_type</w:t>
+      </w:r>
+      <w:proofErr w:type="spellEnd"/>
+      <w:r>
+        <w:rPr>
+          <w:rFonts w:ascii="Arial" w:hAnsi="Arial" w:cs="Arial"/>
+        </w:rPr>
+        <w:t xml:space="preserve"> == “</w:t>
+      </w:r>
+      <w:proofErr w:type="spellStart"/>
+      <w:r>
+        <w:rPr>
+          <w:rFonts w:ascii="Arial" w:hAnsi="Arial" w:cs="Arial"/>
+        </w:rPr>
+        <w:t>with_children</w:t>
+      </w:r>
+      <w:proofErr w:type="spellEnd"/>
+      <w:r>
+        <w:rPr>
+          <w:rFonts w:ascii="Arial" w:hAnsi="Arial" w:cs="Arial"/>
+        </w:rPr>
+        <w:t xml:space="preserve">”) </w:t>
+      </w:r>
+      <w:r>
+        <w:rPr>
+          <w:rFonts w:ascii="Arial" w:hAnsi="Arial" w:cs="Arial"/>
+          <w:highlight w:val="yellow"/>
+        </w:rPr>
+        <w:t>%}</w:t>
       </w:r>
       <w:r>
         <w:rPr>
@@ -591,13 +786,76 @@
           <w:b/>
           <w:bCs/>
         </w:rPr>
-        <w:t>)</w:t>
-      </w:r>
-      <w:r>
-        <w:rPr>
-          <w:rFonts w:ascii="Arial" w:hAnsi="Arial" w:cs="Arial"/>
+        <w:t>13</w:t>
+      </w:r>
+      <w:r>
+        <w:rPr>
+          <w:rFonts w:ascii="Arial" w:hAnsi="Arial" w:cs="Arial"/>
+          <w:highlight w:val="yellow"/>
+        </w:rPr>
+        <w:t xml:space="preserve">{% </w:t>
+      </w:r>
+      <w:proofErr w:type="spellStart"/>
+      <w:r>
+        <w:rPr>
+          <w:rFonts w:ascii="Arial" w:hAnsi="Arial" w:cs="Arial"/>
+          <w:highlight w:val="yellow"/>
+        </w:rPr>
+        <w:t>el</w:t>
+      </w:r>
+      <w:r>
+        <w:rPr>
+          <w:rFonts w:ascii="Arial" w:hAnsi="Arial" w:cs="Arial"/>
+          <w:highlight w:val="yellow"/>
+        </w:rPr>
+        <w:t>if</w:t>
+      </w:r>
+      <w:proofErr w:type="spellEnd"/>
+      <w:r>
+        <w:rPr>
+          <w:rFonts w:ascii="Arial" w:hAnsi="Arial" w:cs="Arial"/>
+          <w:highlight w:val="yellow"/>
         </w:rPr>
         <w:t xml:space="preserve"> </w:t>
+      </w:r>
+      <w:proofErr w:type="spellStart"/>
+      <w:r>
+        <w:rPr>
+          <w:rFonts w:ascii="Arial" w:hAnsi="Arial" w:cs="Arial"/>
+          <w:highlight w:val="yellow"/>
+        </w:rPr>
+        <w:t>tool_ID</w:t>
+      </w:r>
+      <w:proofErr w:type="spellEnd"/>
+      <w:r>
+        <w:rPr>
+          <w:rFonts w:ascii="Arial" w:hAnsi="Arial" w:cs="Arial"/>
+          <w:highlight w:val="yellow"/>
+        </w:rPr>
+        <w:t xml:space="preserve"> == “</w:t>
+      </w:r>
+      <w:proofErr w:type="spellStart"/>
+      <w:r>
+        <w:rPr>
+          <w:rFonts w:ascii="Arial" w:hAnsi="Arial" w:cs="Arial"/>
+          <w:highlight w:val="yellow"/>
+        </w:rPr>
+        <w:t>divorce_complaint</w:t>
+      </w:r>
+      <w:proofErr w:type="spellEnd"/>
+      <w:r>
+        <w:rPr>
+          <w:rFonts w:ascii="Arial" w:hAnsi="Arial" w:cs="Arial"/>
+          <w:highlight w:val="yellow"/>
+        </w:rPr>
+        <w:t>”</w:t>
+      </w:r>
+      <w:r>
+        <w:rPr>
+          <w:rFonts w:ascii="Arial" w:hAnsi="Arial" w:cs="Arial"/>
+          <w:highlight w:val="yellow"/>
+        </w:rPr>
+        <w:t xml:space="preserve"> %}</w:t>
       </w:r>
       <w:r>
         <w:rPr>
@@ -605,7 +863,28 @@
           <w:b/>
           <w:bCs/>
         </w:rPr>
-        <w:t xml:space="preserve">Spousal </w:t>
+        <w:t>8</w:t>
+      </w:r>
+      <w:r>
+        <w:rPr>
+          <w:rFonts w:ascii="Arial" w:hAnsi="Arial" w:cs="Arial"/>
+          <w:highlight w:val="yellow"/>
+        </w:rPr>
+        <w:t>{% el</w:t>
+      </w:r>
+      <w:r>
+        <w:rPr>
+          <w:rFonts w:ascii="Arial" w:hAnsi="Arial" w:cs="Arial"/>
+          <w:highlight w:val="yellow"/>
+        </w:rPr>
+        <w:t xml:space="preserve">se </w:t>
+      </w:r>
+      <w:r>
+        <w:rPr>
+          <w:rFonts w:ascii="Arial" w:hAnsi="Arial" w:cs="Arial"/>
+          <w:highlight w:val="yellow"/>
+        </w:rPr>
+        <w:t>%}</w:t>
       </w:r>
       <w:r>
         <w:rPr>
@@ -613,7 +892,14 @@
           <w:b/>
           <w:bCs/>
         </w:rPr>
-        <w:t>S</w:t>
+        <w:t>9</w:t>
+      </w:r>
+      <w:r>
+        <w:rPr>
+          <w:rFonts w:ascii="Arial" w:hAnsi="Arial" w:cs="Arial"/>
+          <w:highlight w:val="yellow"/>
+        </w:rPr>
+        <w:t>{% endif %}</w:t>
       </w:r>
       <w:r>
         <w:rPr>
@@ -621,6 +907,36 @@
           <w:b/>
           <w:bCs/>
         </w:rPr>
+        <w:t>)</w:t>
+      </w:r>
+      <w:r>
+        <w:rPr>
+          <w:rFonts w:ascii="Arial" w:hAnsi="Arial" w:cs="Arial"/>
+        </w:rPr>
+        <w:t xml:space="preserve"> </w:t>
+      </w:r>
+      <w:r>
+        <w:rPr>
+          <w:rFonts w:ascii="Arial" w:hAnsi="Arial" w:cs="Arial"/>
+          <w:b/>
+          <w:bCs/>
+        </w:rPr>
+        <w:t xml:space="preserve">Spousal </w:t>
+      </w:r>
+      <w:r>
+        <w:rPr>
+          <w:rFonts w:ascii="Arial" w:hAnsi="Arial" w:cs="Arial"/>
+          <w:b/>
+          <w:bCs/>
+        </w:rPr>
+        <w:t>S</w:t>
+      </w:r>
+      <w:r>
+        <w:rPr>
+          <w:rFonts w:ascii="Arial" w:hAnsi="Arial" w:cs="Arial"/>
+          <w:b/>
+          <w:bCs/>
+        </w:rPr>
         <w:t>upport</w:t>
       </w:r>
     </w:p>
@@ -637,6 +953,7 @@
         </w:rPr>
         <w:t xml:space="preserve">The following facts show </w:t>
       </w:r>
+      <w:proofErr w:type="gramStart"/>
       <w:r>
         <w:rPr>
           <w:rFonts w:ascii="Arial" w:hAnsi="Arial" w:cs="Arial"/>
@@ -648,7 +965,21 @@
         <w:rPr>
           <w:rFonts w:ascii="Arial" w:hAnsi="Arial" w:cs="Arial"/>
         </w:rPr>
-        <w:t>user_party_label</w:t>
+        <w:t>user</w:t>
+      </w:r>
+      <w:proofErr w:type="gramEnd"/>
+      <w:r>
+        <w:rPr>
+          <w:rFonts w:ascii="Arial" w:hAnsi="Arial" w:cs="Arial"/>
+        </w:rPr>
+        <w:t>_party_</w:t>
+      </w:r>
+      <w:proofErr w:type="gramStart"/>
+      <w:r>
+        <w:rPr>
+          <w:rFonts w:ascii="Arial" w:hAnsi="Arial" w:cs="Arial"/>
+        </w:rPr>
+        <w:t>label</w:t>
       </w:r>
       <w:proofErr w:type="spellEnd"/>
       <w:r>
@@ -661,8 +992,16 @@
         <w:rPr>
           <w:rFonts w:ascii="Arial" w:hAnsi="Arial" w:cs="Arial"/>
         </w:rPr>
-        <w:t xml:space="preserve">’s need for spousal support and </w:t>
-      </w:r>
+        <w:t>’</w:t>
+      </w:r>
+      <w:proofErr w:type="gramEnd"/>
+      <w:r>
+        <w:rPr>
+          <w:rFonts w:ascii="Arial" w:hAnsi="Arial" w:cs="Arial"/>
+        </w:rPr>
+        <w:t xml:space="preserve">s need for spousal support and </w:t>
+      </w:r>
+      <w:proofErr w:type="gramStart"/>
       <w:r>
         <w:rPr>
           <w:rFonts w:ascii="Arial" w:hAnsi="Arial" w:cs="Arial"/>
@@ -673,7 +1012,21 @@
         <w:rPr>
           <w:rFonts w:ascii="Arial" w:hAnsi="Arial" w:cs="Arial"/>
         </w:rPr>
-        <w:t>OP_party_label</w:t>
+        <w:t>OP</w:t>
+      </w:r>
+      <w:proofErr w:type="gramEnd"/>
+      <w:r>
+        <w:rPr>
+          <w:rFonts w:ascii="Arial" w:hAnsi="Arial" w:cs="Arial"/>
+        </w:rPr>
+        <w:t>_party_</w:t>
+      </w:r>
+      <w:proofErr w:type="gramStart"/>
+      <w:r>
+        <w:rPr>
+          <w:rFonts w:ascii="Arial" w:hAnsi="Arial" w:cs="Arial"/>
+        </w:rPr>
+        <w:t>label</w:t>
       </w:r>
       <w:r>
         <w:rPr>
@@ -685,7 +1038,14 @@
         <w:rPr>
           <w:rFonts w:ascii="Arial" w:hAnsi="Arial" w:cs="Arial"/>
         </w:rPr>
-        <w:t>'s ability to pay:</w:t>
+        <w:t>'</w:t>
+      </w:r>
+      <w:proofErr w:type="gramEnd"/>
+      <w:r>
+        <w:rPr>
+          <w:rFonts w:ascii="Arial" w:hAnsi="Arial" w:cs="Arial"/>
+        </w:rPr>
+        <w:t>s ability to pay:</w:t>
       </w:r>
     </w:p>
     <w:p>
@@ -708,15 +1068,47 @@
           <w:rFonts w:ascii="Arial" w:hAnsi="Arial" w:cs="Arial"/>
           <w:highlight w:val="yellow"/>
         </w:rPr>
-        <w:t>ss_factor_one_division_labor</w:t>
-      </w:r>
-      <w:proofErr w:type="spellEnd"/>
-      <w:r>
-        <w:rPr>
-          <w:rFonts w:ascii="Arial" w:hAnsi="Arial" w:cs="Arial"/>
-          <w:highlight w:val="yellow"/>
-        </w:rPr>
-        <w:t xml:space="preserve"> != “” or ss_factor_one_fault != “” %}</w:t>
+        <w:t>ss_factor_one_division_</w:t>
+      </w:r>
+      <w:proofErr w:type="gramStart"/>
+      <w:r>
+        <w:rPr>
+          <w:rFonts w:ascii="Arial" w:hAnsi="Arial" w:cs="Arial"/>
+          <w:highlight w:val="yellow"/>
+        </w:rPr>
+        <w:t>labor</w:t>
+      </w:r>
+      <w:proofErr w:type="spellEnd"/>
+      <w:r>
+        <w:rPr>
+          <w:rFonts w:ascii="Arial" w:hAnsi="Arial" w:cs="Arial"/>
+          <w:highlight w:val="yellow"/>
+        </w:rPr>
+        <w:t xml:space="preserve"> !</w:t>
+      </w:r>
+      <w:proofErr w:type="gramEnd"/>
+      <w:r>
+        <w:rPr>
+          <w:rFonts w:ascii="Arial" w:hAnsi="Arial" w:cs="Arial"/>
+          <w:highlight w:val="yellow"/>
+        </w:rPr>
+        <w:t>= “” or ss_factor_one_</w:t>
+      </w:r>
+      <w:proofErr w:type="gramStart"/>
+      <w:r>
+        <w:rPr>
+          <w:rFonts w:ascii="Arial" w:hAnsi="Arial" w:cs="Arial"/>
+          <w:highlight w:val="yellow"/>
+        </w:rPr>
+        <w:t>fault !</w:t>
+      </w:r>
+      <w:proofErr w:type="gramEnd"/>
+      <w:r>
+        <w:rPr>
+          <w:rFonts w:ascii="Arial" w:hAnsi="Arial" w:cs="Arial"/>
+          <w:highlight w:val="yellow"/>
+        </w:rPr>
+        <w:t>= “” %}</w:t>
       </w:r>
     </w:p>
     <w:p>
@@ -767,15 +1159,31 @@
           <w:rFonts w:ascii="Arial" w:hAnsi="Arial" w:cs="Arial"/>
           <w:highlight w:val="cyan"/>
         </w:rPr>
-        <w:t>ss_factor_one_division_labor</w:t>
-      </w:r>
-      <w:proofErr w:type="spellEnd"/>
+        <w:t>ss_factor_one_division_</w:t>
+      </w:r>
+      <w:proofErr w:type="gramStart"/>
       <w:r>
         <w:rPr>
           <w:rFonts w:ascii="Arial" w:hAnsi="Arial" w:cs="Arial"/>
           <w:highlight w:val="cyan"/>
         </w:rPr>
-        <w:t xml:space="preserve"> != “” %}</w:t>
+        <w:t>labor</w:t>
+      </w:r>
+      <w:proofErr w:type="spellEnd"/>
+      <w:r>
+        <w:rPr>
+          <w:rFonts w:ascii="Arial" w:hAnsi="Arial" w:cs="Arial"/>
+          <w:highlight w:val="cyan"/>
+        </w:rPr>
+        <w:t xml:space="preserve"> !</w:t>
+      </w:r>
+      <w:proofErr w:type="gramEnd"/>
+      <w:r>
+        <w:rPr>
+          <w:rFonts w:ascii="Arial" w:hAnsi="Arial" w:cs="Arial"/>
+          <w:highlight w:val="cyan"/>
+        </w:rPr>
+        <w:t>= “” %}</w:t>
       </w:r>
     </w:p>
     <w:p>
@@ -791,6 +1199,7 @@
         </w:rPr>
         <w:t xml:space="preserve">Division of work: </w:t>
       </w:r>
+      <w:proofErr w:type="gramStart"/>
       <w:r>
         <w:rPr>
           <w:rFonts w:ascii="Arial" w:hAnsi="Arial" w:cs="Arial"/>
@@ -802,14 +1211,35 @@
         <w:rPr>
           <w:rFonts w:ascii="Arial" w:hAnsi="Arial" w:cs="Arial"/>
         </w:rPr>
-        <w:t>ss_factor_one_division_labor</w:t>
-      </w:r>
-      <w:proofErr w:type="spellEnd"/>
-      <w:r>
-        <w:rPr>
-          <w:rFonts w:ascii="Arial" w:hAnsi="Arial" w:cs="Arial"/>
-        </w:rPr>
-        <w:t xml:space="preserve"> }}</w:t>
+        <w:t>ss</w:t>
+      </w:r>
+      <w:proofErr w:type="gramEnd"/>
+      <w:r>
+        <w:rPr>
+          <w:rFonts w:ascii="Arial" w:hAnsi="Arial" w:cs="Arial"/>
+        </w:rPr>
+        <w:t>_factor_one_division_</w:t>
+      </w:r>
+      <w:proofErr w:type="gramStart"/>
+      <w:r>
+        <w:rPr>
+          <w:rFonts w:ascii="Arial" w:hAnsi="Arial" w:cs="Arial"/>
+        </w:rPr>
+        <w:t>labor</w:t>
+      </w:r>
+      <w:proofErr w:type="spellEnd"/>
+      <w:r>
+        <w:rPr>
+          <w:rFonts w:ascii="Arial" w:hAnsi="Arial" w:cs="Arial"/>
+        </w:rPr>
+        <w:t xml:space="preserve"> }</w:t>
+      </w:r>
+      <w:proofErr w:type="gramEnd"/>
+      <w:r>
+        <w:rPr>
+          <w:rFonts w:ascii="Arial" w:hAnsi="Arial" w:cs="Arial"/>
+        </w:rPr>
+        <w:t>}</w:t>
       </w:r>
     </w:p>
     <w:p>
@@ -824,8 +1254,17 @@
           <w:rFonts w:ascii="Arial" w:hAnsi="Arial" w:cs="Arial"/>
           <w:highlight w:val="cyan"/>
         </w:rPr>
-        <w:t>{%p endif %}</w:t>
-      </w:r>
+        <w:t xml:space="preserve">{%p </w:t>
+      </w:r>
+      <w:proofErr w:type="gramStart"/>
+      <w:r>
+        <w:rPr>
+          <w:rFonts w:ascii="Arial" w:hAnsi="Arial" w:cs="Arial"/>
+          <w:highlight w:val="cyan"/>
+        </w:rPr>
+        <w:t>endif %}</w:t>
+      </w:r>
+      <w:proofErr w:type="gramEnd"/>
     </w:p>
     <w:p>
       <w:pPr>
@@ -846,14 +1285,30 @@
           <w:rFonts w:ascii="Arial" w:hAnsi="Arial" w:cs="Arial"/>
           <w:highlight w:val="cyan"/>
         </w:rPr>
-        <w:t>ss_factor_one_fault</w:t>
-      </w:r>
+        <w:t>ss_factor_one_</w:t>
+      </w:r>
+      <w:proofErr w:type="gramStart"/>
       <w:r>
         <w:rPr>
           <w:rFonts w:ascii="Arial" w:hAnsi="Arial" w:cs="Arial"/>
           <w:highlight w:val="cyan"/>
         </w:rPr>
-        <w:t xml:space="preserve"> != “” %}</w:t>
+        <w:t>fault</w:t>
+      </w:r>
+      <w:r>
+        <w:rPr>
+          <w:rFonts w:ascii="Arial" w:hAnsi="Arial" w:cs="Arial"/>
+          <w:highlight w:val="cyan"/>
+        </w:rPr>
+        <w:t xml:space="preserve"> !</w:t>
+      </w:r>
+      <w:proofErr w:type="gramEnd"/>
+      <w:r>
+        <w:rPr>
+          <w:rFonts w:ascii="Arial" w:hAnsi="Arial" w:cs="Arial"/>
+          <w:highlight w:val="cyan"/>
+        </w:rPr>
+        <w:t>= “” %}</w:t>
       </w:r>
     </w:p>
     <w:p>
@@ -869,11 +1324,33 @@
         </w:rPr>
         <w:t xml:space="preserve">Fault: </w:t>
       </w:r>
-      <w:r>
-        <w:rPr>
-          <w:rFonts w:ascii="Arial" w:hAnsi="Arial" w:cs="Arial"/>
-        </w:rPr>
-        <w:t>{{ ss_factor_one_fault }}</w:t>
+      <w:proofErr w:type="gramStart"/>
+      <w:r>
+        <w:rPr>
+          <w:rFonts w:ascii="Arial" w:hAnsi="Arial" w:cs="Arial"/>
+        </w:rPr>
+        <w:t>{{ ss</w:t>
+      </w:r>
+      <w:proofErr w:type="gramEnd"/>
+      <w:r>
+        <w:rPr>
+          <w:rFonts w:ascii="Arial" w:hAnsi="Arial" w:cs="Arial"/>
+        </w:rPr>
+        <w:t>_factor_one_</w:t>
+      </w:r>
+      <w:proofErr w:type="gramStart"/>
+      <w:r>
+        <w:rPr>
+          <w:rFonts w:ascii="Arial" w:hAnsi="Arial" w:cs="Arial"/>
+        </w:rPr>
+        <w:t>fault }</w:t>
+      </w:r>
+      <w:proofErr w:type="gramEnd"/>
+      <w:r>
+        <w:rPr>
+          <w:rFonts w:ascii="Arial" w:hAnsi="Arial" w:cs="Arial"/>
+        </w:rPr>
+        <w:t>}</w:t>
       </w:r>
     </w:p>
     <w:p>
@@ -888,8 +1365,17 @@
           <w:rFonts w:ascii="Arial" w:hAnsi="Arial" w:cs="Arial"/>
           <w:highlight w:val="cyan"/>
         </w:rPr>
-        <w:t>{%p endif %}</w:t>
-      </w:r>
+        <w:t xml:space="preserve">{%p </w:t>
+      </w:r>
+      <w:proofErr w:type="gramStart"/>
+      <w:r>
+        <w:rPr>
+          <w:rFonts w:ascii="Arial" w:hAnsi="Arial" w:cs="Arial"/>
+          <w:highlight w:val="cyan"/>
+        </w:rPr>
+        <w:t>endif %}</w:t>
+      </w:r>
+      <w:proofErr w:type="gramEnd"/>
     </w:p>
     <w:p>
       <w:pPr>
@@ -903,8 +1389,17 @@
           <w:rFonts w:ascii="Arial" w:hAnsi="Arial" w:cs="Arial"/>
           <w:highlight w:val="yellow"/>
         </w:rPr>
-        <w:t>{%p endif %}</w:t>
-      </w:r>
+        <w:t xml:space="preserve">{%p </w:t>
+      </w:r>
+      <w:proofErr w:type="gramStart"/>
+      <w:r>
+        <w:rPr>
+          <w:rFonts w:ascii="Arial" w:hAnsi="Arial" w:cs="Arial"/>
+          <w:highlight w:val="yellow"/>
+        </w:rPr>
+        <w:t>endif %}</w:t>
+      </w:r>
+      <w:proofErr w:type="gramEnd"/>
     </w:p>
     <w:p>
       <w:pPr>
@@ -926,15 +1421,31 @@
           <w:rFonts w:ascii="Arial" w:hAnsi="Arial" w:cs="Arial"/>
           <w:highlight w:val="yellow"/>
         </w:rPr>
-        <w:t>ss_factor_two_length</w:t>
-      </w:r>
-      <w:proofErr w:type="spellEnd"/>
-      <w:r>
-        <w:rPr>
-          <w:rFonts w:ascii="Arial" w:hAnsi="Arial" w:cs="Arial"/>
-          <w:highlight w:val="yellow"/>
-        </w:rPr>
-        <w:t xml:space="preserve"> != “” %}</w:t>
+        <w:t>ss_factor_two_</w:t>
+      </w:r>
+      <w:proofErr w:type="gramStart"/>
+      <w:r>
+        <w:rPr>
+          <w:rFonts w:ascii="Arial" w:hAnsi="Arial" w:cs="Arial"/>
+          <w:highlight w:val="yellow"/>
+        </w:rPr>
+        <w:t>length</w:t>
+      </w:r>
+      <w:proofErr w:type="spellEnd"/>
+      <w:r>
+        <w:rPr>
+          <w:rFonts w:ascii="Arial" w:hAnsi="Arial" w:cs="Arial"/>
+          <w:highlight w:val="yellow"/>
+        </w:rPr>
+        <w:t xml:space="preserve"> !</w:t>
+      </w:r>
+      <w:proofErr w:type="gramEnd"/>
+      <w:r>
+        <w:rPr>
+          <w:rFonts w:ascii="Arial" w:hAnsi="Arial" w:cs="Arial"/>
+          <w:highlight w:val="yellow"/>
+        </w:rPr>
+        <w:t>= “” %}</w:t>
       </w:r>
     </w:p>
     <w:p>
@@ -971,6 +1482,7 @@
           <w:rFonts w:ascii="Arial" w:hAnsi="Arial" w:cs="Arial"/>
         </w:rPr>
       </w:pPr>
+      <w:proofErr w:type="gramStart"/>
       <w:r>
         <w:rPr>
           <w:rFonts w:ascii="Arial" w:hAnsi="Arial" w:cs="Arial"/>
@@ -982,14 +1494,35 @@
         <w:rPr>
           <w:rFonts w:ascii="Arial" w:hAnsi="Arial" w:cs="Arial"/>
         </w:rPr>
-        <w:t>ss_factor_two_length</w:t>
-      </w:r>
-      <w:proofErr w:type="spellEnd"/>
-      <w:r>
-        <w:rPr>
-          <w:rFonts w:ascii="Arial" w:hAnsi="Arial" w:cs="Arial"/>
-        </w:rPr>
-        <w:t xml:space="preserve"> }}</w:t>
+        <w:t>ss</w:t>
+      </w:r>
+      <w:proofErr w:type="gramEnd"/>
+      <w:r>
+        <w:rPr>
+          <w:rFonts w:ascii="Arial" w:hAnsi="Arial" w:cs="Arial"/>
+        </w:rPr>
+        <w:t>_factor_two_</w:t>
+      </w:r>
+      <w:proofErr w:type="gramStart"/>
+      <w:r>
+        <w:rPr>
+          <w:rFonts w:ascii="Arial" w:hAnsi="Arial" w:cs="Arial"/>
+        </w:rPr>
+        <w:t>length</w:t>
+      </w:r>
+      <w:proofErr w:type="spellEnd"/>
+      <w:r>
+        <w:rPr>
+          <w:rFonts w:ascii="Arial" w:hAnsi="Arial" w:cs="Arial"/>
+        </w:rPr>
+        <w:t xml:space="preserve"> }</w:t>
+      </w:r>
+      <w:proofErr w:type="gramEnd"/>
+      <w:r>
+        <w:rPr>
+          <w:rFonts w:ascii="Arial" w:hAnsi="Arial" w:cs="Arial"/>
+        </w:rPr>
+        <w:t>}</w:t>
       </w:r>
     </w:p>
     <w:p>
@@ -1004,8 +1537,17 @@
           <w:rFonts w:ascii="Arial" w:hAnsi="Arial" w:cs="Arial"/>
           <w:highlight w:val="yellow"/>
         </w:rPr>
-        <w:t>{%p endif %}</w:t>
-      </w:r>
+        <w:t xml:space="preserve">{%p </w:t>
+      </w:r>
+      <w:proofErr w:type="gramStart"/>
+      <w:r>
+        <w:rPr>
+          <w:rFonts w:ascii="Arial" w:hAnsi="Arial" w:cs="Arial"/>
+          <w:highlight w:val="yellow"/>
+        </w:rPr>
+        <w:t>endif %}</w:t>
+      </w:r>
+      <w:proofErr w:type="gramEnd"/>
     </w:p>
     <w:p>
       <w:pPr>
@@ -1027,31 +1569,63 @@
           <w:rFonts w:ascii="Arial" w:hAnsi="Arial" w:cs="Arial"/>
           <w:highlight w:val="yellow"/>
         </w:rPr>
-        <w:t>ss_factor_three_work_user</w:t>
-      </w:r>
-      <w:proofErr w:type="spellEnd"/>
-      <w:r>
-        <w:rPr>
-          <w:rFonts w:ascii="Arial" w:hAnsi="Arial" w:cs="Arial"/>
-          <w:highlight w:val="yellow"/>
-        </w:rPr>
-        <w:t xml:space="preserve"> != “” or </w:t>
-      </w:r>
-      <w:proofErr w:type="spellStart"/>
-      <w:r>
-        <w:rPr>
-          <w:rFonts w:ascii="Arial" w:hAnsi="Arial" w:cs="Arial"/>
-          <w:highlight w:val="yellow"/>
-        </w:rPr>
-        <w:t>ss_factor_three_work_OP</w:t>
-      </w:r>
-      <w:proofErr w:type="spellEnd"/>
-      <w:r>
-        <w:rPr>
-          <w:rFonts w:ascii="Arial" w:hAnsi="Arial" w:cs="Arial"/>
-          <w:highlight w:val="yellow"/>
-        </w:rPr>
-        <w:t xml:space="preserve"> != “” %}</w:t>
+        <w:t>ss_factor_three_work_</w:t>
+      </w:r>
+      <w:proofErr w:type="gramStart"/>
+      <w:r>
+        <w:rPr>
+          <w:rFonts w:ascii="Arial" w:hAnsi="Arial" w:cs="Arial"/>
+          <w:highlight w:val="yellow"/>
+        </w:rPr>
+        <w:t>user</w:t>
+      </w:r>
+      <w:proofErr w:type="spellEnd"/>
+      <w:r>
+        <w:rPr>
+          <w:rFonts w:ascii="Arial" w:hAnsi="Arial" w:cs="Arial"/>
+          <w:highlight w:val="yellow"/>
+        </w:rPr>
+        <w:t xml:space="preserve"> !</w:t>
+      </w:r>
+      <w:proofErr w:type="gramEnd"/>
+      <w:r>
+        <w:rPr>
+          <w:rFonts w:ascii="Arial" w:hAnsi="Arial" w:cs="Arial"/>
+          <w:highlight w:val="yellow"/>
+        </w:rPr>
+        <w:t xml:space="preserve">= “” or </w:t>
+      </w:r>
+      <w:proofErr w:type="spellStart"/>
+      <w:r>
+        <w:rPr>
+          <w:rFonts w:ascii="Arial" w:hAnsi="Arial" w:cs="Arial"/>
+          <w:highlight w:val="yellow"/>
+        </w:rPr>
+        <w:t>ss_factor_three_work_</w:t>
+      </w:r>
+      <w:proofErr w:type="gramStart"/>
+      <w:r>
+        <w:rPr>
+          <w:rFonts w:ascii="Arial" w:hAnsi="Arial" w:cs="Arial"/>
+          <w:highlight w:val="yellow"/>
+        </w:rPr>
+        <w:t>OP</w:t>
+      </w:r>
+      <w:proofErr w:type="spellEnd"/>
+      <w:r>
+        <w:rPr>
+          <w:rFonts w:ascii="Arial" w:hAnsi="Arial" w:cs="Arial"/>
+          <w:highlight w:val="yellow"/>
+        </w:rPr>
+        <w:t xml:space="preserve"> !</w:t>
+      </w:r>
+      <w:proofErr w:type="gramEnd"/>
+      <w:r>
+        <w:rPr>
+          <w:rFonts w:ascii="Arial" w:hAnsi="Arial" w:cs="Arial"/>
+          <w:highlight w:val="yellow"/>
+        </w:rPr>
+        <w:t>= “” %}</w:t>
       </w:r>
     </w:p>
     <w:p>
@@ -1110,15 +1684,31 @@
           <w:rFonts w:ascii="Arial" w:hAnsi="Arial" w:cs="Arial"/>
           <w:highlight w:val="cyan"/>
         </w:rPr>
-        <w:t>ss_factor_three_work_user</w:t>
-      </w:r>
-      <w:proofErr w:type="spellEnd"/>
+        <w:t>ss_factor_three_work_</w:t>
+      </w:r>
+      <w:proofErr w:type="gramStart"/>
       <w:r>
         <w:rPr>
           <w:rFonts w:ascii="Arial" w:hAnsi="Arial" w:cs="Arial"/>
           <w:highlight w:val="cyan"/>
         </w:rPr>
-        <w:t xml:space="preserve"> != “” %}</w:t>
+        <w:t>user</w:t>
+      </w:r>
+      <w:proofErr w:type="spellEnd"/>
+      <w:r>
+        <w:rPr>
+          <w:rFonts w:ascii="Arial" w:hAnsi="Arial" w:cs="Arial"/>
+          <w:highlight w:val="cyan"/>
+        </w:rPr>
+        <w:t xml:space="preserve"> !</w:t>
+      </w:r>
+      <w:proofErr w:type="gramEnd"/>
+      <w:r>
+        <w:rPr>
+          <w:rFonts w:ascii="Arial" w:hAnsi="Arial" w:cs="Arial"/>
+          <w:highlight w:val="cyan"/>
+        </w:rPr>
+        <w:t>= “” %}</w:t>
       </w:r>
     </w:p>
     <w:p>
@@ -1128,11 +1718,19 @@
           <w:rFonts w:ascii="Arial" w:hAnsi="Arial" w:cs="Arial"/>
         </w:rPr>
       </w:pPr>
-      <w:r>
-        <w:rPr>
-          <w:rFonts w:ascii="Arial" w:hAnsi="Arial" w:cs="Arial"/>
-        </w:rPr>
-        <w:t>{{ capitalize(</w:t>
+      <w:proofErr w:type="gramStart"/>
+      <w:r>
+        <w:rPr>
+          <w:rFonts w:ascii="Arial" w:hAnsi="Arial" w:cs="Arial"/>
+        </w:rPr>
+        <w:t>{{ capitalize</w:t>
+      </w:r>
+      <w:proofErr w:type="gramEnd"/>
+      <w:r>
+        <w:rPr>
+          <w:rFonts w:ascii="Arial" w:hAnsi="Arial" w:cs="Arial"/>
+        </w:rPr>
+        <w:t>(</w:t>
       </w:r>
       <w:proofErr w:type="spellStart"/>
       <w:r>
@@ -1142,11 +1740,19 @@
         <w:t>user_party_label</w:t>
       </w:r>
       <w:proofErr w:type="spellEnd"/>
-      <w:r>
-        <w:rPr>
-          <w:rFonts w:ascii="Arial" w:hAnsi="Arial" w:cs="Arial"/>
-        </w:rPr>
-        <w:t>) }}</w:t>
+      <w:proofErr w:type="gramStart"/>
+      <w:r>
+        <w:rPr>
+          <w:rFonts w:ascii="Arial" w:hAnsi="Arial" w:cs="Arial"/>
+        </w:rPr>
+        <w:t>) }</w:t>
+      </w:r>
+      <w:proofErr w:type="gramEnd"/>
+      <w:r>
+        <w:rPr>
+          <w:rFonts w:ascii="Arial" w:hAnsi="Arial" w:cs="Arial"/>
+        </w:rPr>
+        <w:t>}</w:t>
       </w:r>
       <w:r>
         <w:rPr>
@@ -1154,6 +1760,7 @@
         </w:rPr>
         <w:t xml:space="preserve">: </w:t>
       </w:r>
+      <w:proofErr w:type="gramStart"/>
       <w:r>
         <w:rPr>
           <w:rFonts w:ascii="Arial" w:hAnsi="Arial" w:cs="Arial"/>
@@ -1165,14 +1772,35 @@
         <w:rPr>
           <w:rFonts w:ascii="Arial" w:hAnsi="Arial" w:cs="Arial"/>
         </w:rPr>
-        <w:t>ss_factor_three_work_user</w:t>
-      </w:r>
-      <w:proofErr w:type="spellEnd"/>
-      <w:r>
-        <w:rPr>
-          <w:rFonts w:ascii="Arial" w:hAnsi="Arial" w:cs="Arial"/>
-        </w:rPr>
-        <w:t xml:space="preserve"> }}</w:t>
+        <w:t>ss</w:t>
+      </w:r>
+      <w:proofErr w:type="gramEnd"/>
+      <w:r>
+        <w:rPr>
+          <w:rFonts w:ascii="Arial" w:hAnsi="Arial" w:cs="Arial"/>
+        </w:rPr>
+        <w:t>_factor_three_work_</w:t>
+      </w:r>
+      <w:proofErr w:type="gramStart"/>
+      <w:r>
+        <w:rPr>
+          <w:rFonts w:ascii="Arial" w:hAnsi="Arial" w:cs="Arial"/>
+        </w:rPr>
+        <w:t>user</w:t>
+      </w:r>
+      <w:proofErr w:type="spellEnd"/>
+      <w:r>
+        <w:rPr>
+          <w:rFonts w:ascii="Arial" w:hAnsi="Arial" w:cs="Arial"/>
+        </w:rPr>
+        <w:t xml:space="preserve"> }</w:t>
+      </w:r>
+      <w:proofErr w:type="gramEnd"/>
+      <w:r>
+        <w:rPr>
+          <w:rFonts w:ascii="Arial" w:hAnsi="Arial" w:cs="Arial"/>
+        </w:rPr>
+        <w:t>}</w:t>
       </w:r>
     </w:p>
     <w:p>
@@ -1187,8 +1815,17 @@
           <w:rFonts w:ascii="Arial" w:hAnsi="Arial" w:cs="Arial"/>
           <w:highlight w:val="cyan"/>
         </w:rPr>
-        <w:t>{%p endif %}</w:t>
-      </w:r>
+        <w:t xml:space="preserve">{%p </w:t>
+      </w:r>
+      <w:proofErr w:type="gramStart"/>
+      <w:r>
+        <w:rPr>
+          <w:rFonts w:ascii="Arial" w:hAnsi="Arial" w:cs="Arial"/>
+          <w:highlight w:val="cyan"/>
+        </w:rPr>
+        <w:t>endif %}</w:t>
+      </w:r>
+      <w:proofErr w:type="gramEnd"/>
     </w:p>
     <w:p>
       <w:pPr>
@@ -1202,6 +1839,7 @@
           <w:rFonts w:ascii="Arial" w:hAnsi="Arial" w:cs="Arial"/>
           <w:highlight w:val="cyan"/>
         </w:rPr>
+        <w:lastRenderedPageBreak/>
         <w:t xml:space="preserve">{%p if </w:t>
       </w:r>
       <w:proofErr w:type="spellStart"/>
@@ -1210,15 +1848,31 @@
           <w:rFonts w:ascii="Arial" w:hAnsi="Arial" w:cs="Arial"/>
           <w:highlight w:val="cyan"/>
         </w:rPr>
-        <w:t>ss_factor_three_work_OP</w:t>
-      </w:r>
-      <w:proofErr w:type="spellEnd"/>
+        <w:t>ss_factor_three_work_</w:t>
+      </w:r>
+      <w:proofErr w:type="gramStart"/>
       <w:r>
         <w:rPr>
           <w:rFonts w:ascii="Arial" w:hAnsi="Arial" w:cs="Arial"/>
           <w:highlight w:val="cyan"/>
         </w:rPr>
-        <w:t xml:space="preserve"> != “” %}</w:t>
+        <w:t>OP</w:t>
+      </w:r>
+      <w:proofErr w:type="spellEnd"/>
+      <w:r>
+        <w:rPr>
+          <w:rFonts w:ascii="Arial" w:hAnsi="Arial" w:cs="Arial"/>
+          <w:highlight w:val="cyan"/>
+        </w:rPr>
+        <w:t xml:space="preserve"> !</w:t>
+      </w:r>
+      <w:proofErr w:type="gramEnd"/>
+      <w:r>
+        <w:rPr>
+          <w:rFonts w:ascii="Arial" w:hAnsi="Arial" w:cs="Arial"/>
+          <w:highlight w:val="cyan"/>
+        </w:rPr>
+        <w:t>= “” %}</w:t>
       </w:r>
     </w:p>
     <w:p>
@@ -1228,11 +1882,19 @@
           <w:rFonts w:ascii="Arial" w:hAnsi="Arial" w:cs="Arial"/>
         </w:rPr>
       </w:pPr>
-      <w:r>
-        <w:rPr>
-          <w:rFonts w:ascii="Arial" w:hAnsi="Arial" w:cs="Arial"/>
-        </w:rPr>
-        <w:t>{{ capitalize(</w:t>
+      <w:proofErr w:type="gramStart"/>
+      <w:r>
+        <w:rPr>
+          <w:rFonts w:ascii="Arial" w:hAnsi="Arial" w:cs="Arial"/>
+        </w:rPr>
+        <w:t>{{ capitalize</w:t>
+      </w:r>
+      <w:proofErr w:type="gramEnd"/>
+      <w:r>
+        <w:rPr>
+          <w:rFonts w:ascii="Arial" w:hAnsi="Arial" w:cs="Arial"/>
+        </w:rPr>
+        <w:t>(</w:t>
       </w:r>
       <w:proofErr w:type="spellStart"/>
       <w:r>
@@ -1242,11 +1904,19 @@
         <w:t>OP_party_label</w:t>
       </w:r>
       <w:proofErr w:type="spellEnd"/>
-      <w:r>
-        <w:rPr>
-          <w:rFonts w:ascii="Arial" w:hAnsi="Arial" w:cs="Arial"/>
-        </w:rPr>
-        <w:t>) }}</w:t>
+      <w:proofErr w:type="gramStart"/>
+      <w:r>
+        <w:rPr>
+          <w:rFonts w:ascii="Arial" w:hAnsi="Arial" w:cs="Arial"/>
+        </w:rPr>
+        <w:t>) }</w:t>
+      </w:r>
+      <w:proofErr w:type="gramEnd"/>
+      <w:r>
+        <w:rPr>
+          <w:rFonts w:ascii="Arial" w:hAnsi="Arial" w:cs="Arial"/>
+        </w:rPr>
+        <w:t>}</w:t>
       </w:r>
       <w:r>
         <w:rPr>
@@ -1254,6 +1924,7 @@
         </w:rPr>
         <w:t xml:space="preserve">: </w:t>
       </w:r>
+      <w:proofErr w:type="gramStart"/>
       <w:r>
         <w:rPr>
           <w:rFonts w:ascii="Arial" w:hAnsi="Arial" w:cs="Arial"/>
@@ -1265,14 +1936,35 @@
         <w:rPr>
           <w:rFonts w:ascii="Arial" w:hAnsi="Arial" w:cs="Arial"/>
         </w:rPr>
-        <w:t>ss_factor_three_work_OP</w:t>
-      </w:r>
-      <w:proofErr w:type="spellEnd"/>
-      <w:r>
-        <w:rPr>
-          <w:rFonts w:ascii="Arial" w:hAnsi="Arial" w:cs="Arial"/>
-        </w:rPr>
-        <w:t xml:space="preserve"> }}</w:t>
+        <w:t>ss</w:t>
+      </w:r>
+      <w:proofErr w:type="gramEnd"/>
+      <w:r>
+        <w:rPr>
+          <w:rFonts w:ascii="Arial" w:hAnsi="Arial" w:cs="Arial"/>
+        </w:rPr>
+        <w:t>_factor_three_work_</w:t>
+      </w:r>
+      <w:proofErr w:type="gramStart"/>
+      <w:r>
+        <w:rPr>
+          <w:rFonts w:ascii="Arial" w:hAnsi="Arial" w:cs="Arial"/>
+        </w:rPr>
+        <w:t>OP</w:t>
+      </w:r>
+      <w:proofErr w:type="spellEnd"/>
+      <w:r>
+        <w:rPr>
+          <w:rFonts w:ascii="Arial" w:hAnsi="Arial" w:cs="Arial"/>
+        </w:rPr>
+        <w:t xml:space="preserve"> }</w:t>
+      </w:r>
+      <w:proofErr w:type="gramEnd"/>
+      <w:r>
+        <w:rPr>
+          <w:rFonts w:ascii="Arial" w:hAnsi="Arial" w:cs="Arial"/>
+        </w:rPr>
+        <w:t>}</w:t>
       </w:r>
     </w:p>
     <w:p>
@@ -1287,9 +1979,17 @@
           <w:rFonts w:ascii="Arial" w:hAnsi="Arial" w:cs="Arial"/>
           <w:highlight w:val="cyan"/>
         </w:rPr>
-        <w:lastRenderedPageBreak/>
-        <w:t>{%p endif %}</w:t>
-      </w:r>
+        <w:t xml:space="preserve">{%p </w:t>
+      </w:r>
+      <w:proofErr w:type="gramStart"/>
+      <w:r>
+        <w:rPr>
+          <w:rFonts w:ascii="Arial" w:hAnsi="Arial" w:cs="Arial"/>
+          <w:highlight w:val="cyan"/>
+        </w:rPr>
+        <w:t>endif %}</w:t>
+      </w:r>
+      <w:proofErr w:type="gramEnd"/>
     </w:p>
     <w:p>
       <w:pPr>
@@ -1303,8 +2003,17 @@
           <w:rFonts w:ascii="Arial" w:hAnsi="Arial" w:cs="Arial"/>
           <w:highlight w:val="yellow"/>
         </w:rPr>
-        <w:t>{%p endif %}</w:t>
-      </w:r>
+        <w:t xml:space="preserve">{%p </w:t>
+      </w:r>
+      <w:proofErr w:type="gramStart"/>
+      <w:r>
+        <w:rPr>
+          <w:rFonts w:ascii="Arial" w:hAnsi="Arial" w:cs="Arial"/>
+          <w:highlight w:val="yellow"/>
+        </w:rPr>
+        <w:t>endif %}</w:t>
+      </w:r>
+      <w:proofErr w:type="gramEnd"/>
     </w:p>
     <w:p>
       <w:pPr>
@@ -1340,39 +2049,103 @@
           <w:rFonts w:ascii="Arial" w:hAnsi="Arial" w:cs="Arial"/>
         </w:rPr>
       </w:pPr>
-      <w:r>
-        <w:rPr>
-          <w:rFonts w:ascii="Arial" w:hAnsi="Arial" w:cs="Arial"/>
-        </w:rPr>
-        <w:t>{{ users[0].</w:t>
-      </w:r>
-      <w:proofErr w:type="spellStart"/>
-      <w:r>
-        <w:rPr>
-          <w:rFonts w:ascii="Arial" w:hAnsi="Arial" w:cs="Arial"/>
-        </w:rPr>
-        <w:t>name_full</w:t>
-      </w:r>
-      <w:proofErr w:type="spellEnd"/>
-      <w:r>
-        <w:rPr>
-          <w:rFonts w:ascii="Arial" w:hAnsi="Arial" w:cs="Arial"/>
-        </w:rPr>
-        <w:t>() }}: {{ users[0].</w:t>
-      </w:r>
-      <w:proofErr w:type="spellStart"/>
-      <w:r>
-        <w:rPr>
-          <w:rFonts w:ascii="Arial" w:hAnsi="Arial" w:cs="Arial"/>
-        </w:rPr>
-        <w:t>age_in_years</w:t>
-      </w:r>
-      <w:proofErr w:type="spellEnd"/>
-      <w:r>
-        <w:rPr>
-          <w:rFonts w:ascii="Arial" w:hAnsi="Arial" w:cs="Arial"/>
-        </w:rPr>
-        <w:t>() }}</w:t>
+      <w:proofErr w:type="gramStart"/>
+      <w:r>
+        <w:rPr>
+          <w:rFonts w:ascii="Arial" w:hAnsi="Arial" w:cs="Arial"/>
+        </w:rPr>
+        <w:t>{{ users</w:t>
+      </w:r>
+      <w:proofErr w:type="gramEnd"/>
+      <w:r>
+        <w:rPr>
+          <w:rFonts w:ascii="Arial" w:hAnsi="Arial" w:cs="Arial"/>
+        </w:rPr>
+        <w:t>[0].</w:t>
+      </w:r>
+      <w:proofErr w:type="spellStart"/>
+      <w:r>
+        <w:rPr>
+          <w:rFonts w:ascii="Arial" w:hAnsi="Arial" w:cs="Arial"/>
+        </w:rPr>
+        <w:t>name_</w:t>
+      </w:r>
+      <w:proofErr w:type="gramStart"/>
+      <w:r>
+        <w:rPr>
+          <w:rFonts w:ascii="Arial" w:hAnsi="Arial" w:cs="Arial"/>
+        </w:rPr>
+        <w:t>full</w:t>
+      </w:r>
+      <w:proofErr w:type="spellEnd"/>
+      <w:r>
+        <w:rPr>
+          <w:rFonts w:ascii="Arial" w:hAnsi="Arial" w:cs="Arial"/>
+        </w:rPr>
+        <w:t>() }</w:t>
+      </w:r>
+      <w:proofErr w:type="gramEnd"/>
+      <w:r>
+        <w:rPr>
+          <w:rFonts w:ascii="Arial" w:hAnsi="Arial" w:cs="Arial"/>
+        </w:rPr>
+        <w:t xml:space="preserve">}: </w:t>
+      </w:r>
+      <w:proofErr w:type="gramStart"/>
+      <w:r>
+        <w:rPr>
+          <w:rFonts w:ascii="Arial" w:hAnsi="Arial" w:cs="Arial"/>
+        </w:rPr>
+        <w:t>{{ users</w:t>
+      </w:r>
+      <w:proofErr w:type="gramEnd"/>
+      <w:r>
+        <w:rPr>
+          <w:rFonts w:ascii="Arial" w:hAnsi="Arial" w:cs="Arial"/>
+        </w:rPr>
+        <w:t>[0</w:t>
+      </w:r>
+      <w:proofErr w:type="gramStart"/>
+      <w:r>
+        <w:rPr>
+          <w:rFonts w:ascii="Arial" w:hAnsi="Arial" w:cs="Arial"/>
+        </w:rPr>
+        <w:t>].</w:t>
+      </w:r>
+      <w:proofErr w:type="spellStart"/>
+      <w:r>
+        <w:rPr>
+          <w:rFonts w:ascii="Arial" w:hAnsi="Arial" w:cs="Arial"/>
+        </w:rPr>
+        <w:t>age</w:t>
+      </w:r>
+      <w:proofErr w:type="gramEnd"/>
+      <w:r>
+        <w:rPr>
+          <w:rFonts w:ascii="Arial" w:hAnsi="Arial" w:cs="Arial"/>
+        </w:rPr>
+        <w:t>_in_</w:t>
+      </w:r>
+      <w:proofErr w:type="gramStart"/>
+      <w:r>
+        <w:rPr>
+          <w:rFonts w:ascii="Arial" w:hAnsi="Arial" w:cs="Arial"/>
+        </w:rPr>
+        <w:t>years</w:t>
+      </w:r>
+      <w:proofErr w:type="spellEnd"/>
+      <w:r>
+        <w:rPr>
+          <w:rFonts w:ascii="Arial" w:hAnsi="Arial" w:cs="Arial"/>
+        </w:rPr>
+        <w:t>() }</w:t>
+      </w:r>
+      <w:proofErr w:type="gramEnd"/>
+      <w:r>
+        <w:rPr>
+          <w:rFonts w:ascii="Arial" w:hAnsi="Arial" w:cs="Arial"/>
+        </w:rPr>
+        <w:t>}</w:t>
       </w:r>
     </w:p>
     <w:p>
@@ -1382,6 +2155,7 @@
           <w:rFonts w:ascii="Arial" w:hAnsi="Arial" w:cs="Arial"/>
         </w:rPr>
       </w:pPr>
+      <w:proofErr w:type="gramStart"/>
       <w:r>
         <w:rPr>
           <w:rFonts w:ascii="Arial" w:hAnsi="Arial" w:cs="Arial"/>
@@ -1393,7 +2167,14 @@
         <w:rPr>
           <w:rFonts w:ascii="Arial" w:hAnsi="Arial" w:cs="Arial"/>
         </w:rPr>
-        <w:t>other_parties</w:t>
+        <w:t>other</w:t>
+      </w:r>
+      <w:proofErr w:type="gramEnd"/>
+      <w:r>
+        <w:rPr>
+          <w:rFonts w:ascii="Arial" w:hAnsi="Arial" w:cs="Arial"/>
+        </w:rPr>
+        <w:t>_parties</w:t>
       </w:r>
       <w:proofErr w:type="spellEnd"/>
       <w:r>
@@ -1407,42 +2188,98 @@
         <w:rPr>
           <w:rFonts w:ascii="Arial" w:hAnsi="Arial" w:cs="Arial"/>
         </w:rPr>
-        <w:t>name_full</w:t>
-      </w:r>
-      <w:proofErr w:type="spellEnd"/>
-      <w:r>
-        <w:rPr>
-          <w:rFonts w:ascii="Arial" w:hAnsi="Arial" w:cs="Arial"/>
-        </w:rPr>
-        <w:t xml:space="preserve">() }}: {{ </w:t>
-      </w:r>
-      <w:proofErr w:type="spellStart"/>
-      <w:r>
-        <w:rPr>
-          <w:rFonts w:ascii="Arial" w:hAnsi="Arial" w:cs="Arial"/>
-        </w:rPr>
-        <w:t>other_parties</w:t>
-      </w:r>
-      <w:proofErr w:type="spellEnd"/>
-      <w:r>
-        <w:rPr>
-          <w:rFonts w:ascii="Arial" w:hAnsi="Arial" w:cs="Arial"/>
-        </w:rPr>
-        <w:t>[0].</w:t>
-      </w:r>
-      <w:proofErr w:type="spellStart"/>
-      <w:r>
-        <w:rPr>
-          <w:rFonts w:ascii="Arial" w:hAnsi="Arial" w:cs="Arial"/>
-        </w:rPr>
-        <w:t>age_in_years</w:t>
-      </w:r>
-      <w:proofErr w:type="spellEnd"/>
-      <w:r>
-        <w:rPr>
-          <w:rFonts w:ascii="Arial" w:hAnsi="Arial" w:cs="Arial"/>
-        </w:rPr>
-        <w:t>() }}</w:t>
+        <w:t>name_</w:t>
+      </w:r>
+      <w:proofErr w:type="gramStart"/>
+      <w:r>
+        <w:rPr>
+          <w:rFonts w:ascii="Arial" w:hAnsi="Arial" w:cs="Arial"/>
+        </w:rPr>
+        <w:t>full</w:t>
+      </w:r>
+      <w:proofErr w:type="spellEnd"/>
+      <w:r>
+        <w:rPr>
+          <w:rFonts w:ascii="Arial" w:hAnsi="Arial" w:cs="Arial"/>
+        </w:rPr>
+        <w:t>() }</w:t>
+      </w:r>
+      <w:proofErr w:type="gramEnd"/>
+      <w:r>
+        <w:rPr>
+          <w:rFonts w:ascii="Arial" w:hAnsi="Arial" w:cs="Arial"/>
+        </w:rPr>
+        <w:t xml:space="preserve">}: </w:t>
+      </w:r>
+      <w:proofErr w:type="gramStart"/>
+      <w:r>
+        <w:rPr>
+          <w:rFonts w:ascii="Arial" w:hAnsi="Arial" w:cs="Arial"/>
+        </w:rPr>
+        <w:t xml:space="preserve">{{ </w:t>
+      </w:r>
+      <w:proofErr w:type="spellStart"/>
+      <w:r>
+        <w:rPr>
+          <w:rFonts w:ascii="Arial" w:hAnsi="Arial" w:cs="Arial"/>
+        </w:rPr>
+        <w:t>other</w:t>
+      </w:r>
+      <w:proofErr w:type="gramEnd"/>
+      <w:r>
+        <w:rPr>
+          <w:rFonts w:ascii="Arial" w:hAnsi="Arial" w:cs="Arial"/>
+        </w:rPr>
+        <w:t>_parties</w:t>
+      </w:r>
+      <w:proofErr w:type="spellEnd"/>
+      <w:r>
+        <w:rPr>
+          <w:rFonts w:ascii="Arial" w:hAnsi="Arial" w:cs="Arial"/>
+        </w:rPr>
+        <w:t>[0</w:t>
+      </w:r>
+      <w:proofErr w:type="gramStart"/>
+      <w:r>
+        <w:rPr>
+          <w:rFonts w:ascii="Arial" w:hAnsi="Arial" w:cs="Arial"/>
+        </w:rPr>
+        <w:t>].</w:t>
+      </w:r>
+      <w:proofErr w:type="spellStart"/>
+      <w:r>
+        <w:rPr>
+          <w:rFonts w:ascii="Arial" w:hAnsi="Arial" w:cs="Arial"/>
+        </w:rPr>
+        <w:t>age</w:t>
+      </w:r>
+      <w:proofErr w:type="gramEnd"/>
+      <w:r>
+        <w:rPr>
+          <w:rFonts w:ascii="Arial" w:hAnsi="Arial" w:cs="Arial"/>
+        </w:rPr>
+        <w:t>_in_</w:t>
+      </w:r>
+      <w:proofErr w:type="gramStart"/>
+      <w:r>
+        <w:rPr>
+          <w:rFonts w:ascii="Arial" w:hAnsi="Arial" w:cs="Arial"/>
+        </w:rPr>
+        <w:t>years</w:t>
+      </w:r>
+      <w:proofErr w:type="spellEnd"/>
+      <w:r>
+        <w:rPr>
+          <w:rFonts w:ascii="Arial" w:hAnsi="Arial" w:cs="Arial"/>
+        </w:rPr>
+        <w:t>() }</w:t>
+      </w:r>
+      <w:proofErr w:type="gramEnd"/>
+      <w:r>
+        <w:rPr>
+          <w:rFonts w:ascii="Arial" w:hAnsi="Arial" w:cs="Arial"/>
+        </w:rPr>
+        <w:t>}</w:t>
       </w:r>
     </w:p>
     <w:p>
@@ -1465,15 +2302,31 @@
           <w:rFonts w:ascii="Arial" w:hAnsi="Arial" w:cs="Arial"/>
           <w:highlight w:val="yellow"/>
         </w:rPr>
-        <w:t>ss_factor_six_ability_to_pay</w:t>
-      </w:r>
-      <w:proofErr w:type="spellEnd"/>
-      <w:r>
-        <w:rPr>
-          <w:rFonts w:ascii="Arial" w:hAnsi="Arial" w:cs="Arial"/>
-          <w:highlight w:val="yellow"/>
-        </w:rPr>
-        <w:t xml:space="preserve"> != “” %}</w:t>
+        <w:t>ss_factor_six_ability_to_</w:t>
+      </w:r>
+      <w:proofErr w:type="gramStart"/>
+      <w:r>
+        <w:rPr>
+          <w:rFonts w:ascii="Arial" w:hAnsi="Arial" w:cs="Arial"/>
+          <w:highlight w:val="yellow"/>
+        </w:rPr>
+        <w:t>pay</w:t>
+      </w:r>
+      <w:proofErr w:type="spellEnd"/>
+      <w:r>
+        <w:rPr>
+          <w:rFonts w:ascii="Arial" w:hAnsi="Arial" w:cs="Arial"/>
+          <w:highlight w:val="yellow"/>
+        </w:rPr>
+        <w:t xml:space="preserve"> !</w:t>
+      </w:r>
+      <w:proofErr w:type="gramEnd"/>
+      <w:r>
+        <w:rPr>
+          <w:rFonts w:ascii="Arial" w:hAnsi="Arial" w:cs="Arial"/>
+          <w:highlight w:val="yellow"/>
+        </w:rPr>
+        <w:t>= “” %}</w:t>
       </w:r>
     </w:p>
     <w:p>
@@ -1494,6 +2347,7 @@
           <w:bCs/>
         </w:rPr>
       </w:pPr>
+      <w:proofErr w:type="gramStart"/>
       <w:r>
         <w:rPr>
           <w:rFonts w:ascii="Arial" w:hAnsi="Arial" w:cs="Arial"/>
@@ -1508,15 +2362,16 @@
           <w:b/>
           <w:bCs/>
         </w:rPr>
-        <w:t>capitalize(</w:t>
-      </w:r>
+        <w:t>capitalize</w:t>
+      </w:r>
+      <w:proofErr w:type="gramEnd"/>
       <w:r>
         <w:rPr>
           <w:rFonts w:ascii="Arial" w:hAnsi="Arial" w:cs="Arial"/>
           <w:b/>
           <w:bCs/>
         </w:rPr>
-        <w:t>OP_party_label</w:t>
+        <w:t>(</w:t>
       </w:r>
       <w:r>
         <w:rPr>
@@ -1524,15 +2379,16 @@
           <w:b/>
           <w:bCs/>
         </w:rPr>
-        <w:t>)</w:t>
-      </w:r>
+        <w:t>OP_party_label</w:t>
+      </w:r>
+      <w:proofErr w:type="gramStart"/>
       <w:r>
         <w:rPr>
           <w:rFonts w:ascii="Arial" w:hAnsi="Arial" w:cs="Arial"/>
           <w:b/>
           <w:bCs/>
         </w:rPr>
-        <w:t xml:space="preserve"> }}’s</w:t>
+        <w:t>)</w:t>
       </w:r>
       <w:r>
         <w:rPr>
@@ -1540,6 +2396,23 @@
           <w:b/>
           <w:bCs/>
         </w:rPr>
+        <w:t xml:space="preserve"> }}’</w:t>
+      </w:r>
+      <w:proofErr w:type="gramEnd"/>
+      <w:r>
+        <w:rPr>
+          <w:rFonts w:ascii="Arial" w:hAnsi="Arial" w:cs="Arial"/>
+          <w:b/>
+          <w:bCs/>
+        </w:rPr>
+        <w:t>s</w:t>
+      </w:r>
+      <w:r>
+        <w:rPr>
+          <w:rFonts w:ascii="Arial" w:hAnsi="Arial" w:cs="Arial"/>
+          <w:b/>
+          <w:bCs/>
+        </w:rPr>
         <w:t xml:space="preserve"> ability to pay spousal support:</w:t>
       </w:r>
     </w:p>
@@ -1550,6 +2423,7 @@
           <w:rFonts w:ascii="Arial" w:hAnsi="Arial" w:cs="Arial"/>
         </w:rPr>
       </w:pPr>
+      <w:proofErr w:type="gramStart"/>
       <w:r>
         <w:rPr>
           <w:rFonts w:ascii="Arial" w:hAnsi="Arial" w:cs="Arial"/>
@@ -1561,14 +2435,35 @@
         <w:rPr>
           <w:rFonts w:ascii="Arial" w:hAnsi="Arial" w:cs="Arial"/>
         </w:rPr>
-        <w:t>ss_factor_six_ability_to_pay</w:t>
-      </w:r>
-      <w:proofErr w:type="spellEnd"/>
-      <w:r>
-        <w:rPr>
-          <w:rFonts w:ascii="Arial" w:hAnsi="Arial" w:cs="Arial"/>
-        </w:rPr>
-        <w:t xml:space="preserve"> }}</w:t>
+        <w:t>ss</w:t>
+      </w:r>
+      <w:proofErr w:type="gramEnd"/>
+      <w:r>
+        <w:rPr>
+          <w:rFonts w:ascii="Arial" w:hAnsi="Arial" w:cs="Arial"/>
+        </w:rPr>
+        <w:t>_factor_six_ability_to_</w:t>
+      </w:r>
+      <w:proofErr w:type="gramStart"/>
+      <w:r>
+        <w:rPr>
+          <w:rFonts w:ascii="Arial" w:hAnsi="Arial" w:cs="Arial"/>
+        </w:rPr>
+        <w:t>pay</w:t>
+      </w:r>
+      <w:proofErr w:type="spellEnd"/>
+      <w:r>
+        <w:rPr>
+          <w:rFonts w:ascii="Arial" w:hAnsi="Arial" w:cs="Arial"/>
+        </w:rPr>
+        <w:t xml:space="preserve"> }</w:t>
+      </w:r>
+      <w:proofErr w:type="gramEnd"/>
+      <w:r>
+        <w:rPr>
+          <w:rFonts w:ascii="Arial" w:hAnsi="Arial" w:cs="Arial"/>
+        </w:rPr>
+        <w:t>}</w:t>
       </w:r>
     </w:p>
     <w:p>
@@ -1583,8 +2478,17 @@
           <w:rFonts w:ascii="Arial" w:hAnsi="Arial" w:cs="Arial"/>
           <w:highlight w:val="yellow"/>
         </w:rPr>
-        <w:t>{%p endif %}</w:t>
-      </w:r>
+        <w:t xml:space="preserve">{%p </w:t>
+      </w:r>
+      <w:proofErr w:type="gramStart"/>
+      <w:r>
+        <w:rPr>
+          <w:rFonts w:ascii="Arial" w:hAnsi="Arial" w:cs="Arial"/>
+          <w:highlight w:val="yellow"/>
+        </w:rPr>
+        <w:t>endif %}</w:t>
+      </w:r>
+      <w:proofErr w:type="gramEnd"/>
     </w:p>
     <w:p>
       <w:pPr>
@@ -1606,15 +2510,31 @@
           <w:rFonts w:ascii="Arial" w:hAnsi="Arial" w:cs="Arial"/>
           <w:highlight w:val="yellow"/>
         </w:rPr>
-        <w:t>ss_factor_seven_situation</w:t>
-      </w:r>
-      <w:proofErr w:type="spellEnd"/>
-      <w:r>
-        <w:rPr>
-          <w:rFonts w:ascii="Arial" w:hAnsi="Arial" w:cs="Arial"/>
-          <w:highlight w:val="yellow"/>
-        </w:rPr>
-        <w:t xml:space="preserve"> != “” %}</w:t>
+        <w:t>ss_factor_seven_</w:t>
+      </w:r>
+      <w:proofErr w:type="gramStart"/>
+      <w:r>
+        <w:rPr>
+          <w:rFonts w:ascii="Arial" w:hAnsi="Arial" w:cs="Arial"/>
+          <w:highlight w:val="yellow"/>
+        </w:rPr>
+        <w:t>situation</w:t>
+      </w:r>
+      <w:proofErr w:type="spellEnd"/>
+      <w:r>
+        <w:rPr>
+          <w:rFonts w:ascii="Arial" w:hAnsi="Arial" w:cs="Arial"/>
+          <w:highlight w:val="yellow"/>
+        </w:rPr>
+        <w:t xml:space="preserve"> !</w:t>
+      </w:r>
+      <w:proofErr w:type="gramEnd"/>
+      <w:r>
+        <w:rPr>
+          <w:rFonts w:ascii="Arial" w:hAnsi="Arial" w:cs="Arial"/>
+          <w:highlight w:val="yellow"/>
+        </w:rPr>
+        <w:t>= “” %}</w:t>
       </w:r>
     </w:p>
     <w:p>
@@ -1651,6 +2571,7 @@
           <w:rFonts w:ascii="Arial" w:hAnsi="Arial" w:cs="Arial"/>
         </w:rPr>
       </w:pPr>
+      <w:proofErr w:type="gramStart"/>
       <w:r>
         <w:rPr>
           <w:rFonts w:ascii="Arial" w:hAnsi="Arial" w:cs="Arial"/>
@@ -1662,14 +2583,35 @@
         <w:rPr>
           <w:rFonts w:ascii="Arial" w:hAnsi="Arial" w:cs="Arial"/>
         </w:rPr>
-        <w:t>ss_factor_seven_situation</w:t>
-      </w:r>
-      <w:proofErr w:type="spellEnd"/>
-      <w:r>
-        <w:rPr>
-          <w:rFonts w:ascii="Arial" w:hAnsi="Arial" w:cs="Arial"/>
-        </w:rPr>
-        <w:t xml:space="preserve"> }}</w:t>
+        <w:t>ss</w:t>
+      </w:r>
+      <w:proofErr w:type="gramEnd"/>
+      <w:r>
+        <w:rPr>
+          <w:rFonts w:ascii="Arial" w:hAnsi="Arial" w:cs="Arial"/>
+        </w:rPr>
+        <w:t>_factor_seven_</w:t>
+      </w:r>
+      <w:proofErr w:type="gramStart"/>
+      <w:r>
+        <w:rPr>
+          <w:rFonts w:ascii="Arial" w:hAnsi="Arial" w:cs="Arial"/>
+        </w:rPr>
+        <w:t>situation</w:t>
+      </w:r>
+      <w:proofErr w:type="spellEnd"/>
+      <w:r>
+        <w:rPr>
+          <w:rFonts w:ascii="Arial" w:hAnsi="Arial" w:cs="Arial"/>
+        </w:rPr>
+        <w:t xml:space="preserve"> }</w:t>
+      </w:r>
+      <w:proofErr w:type="gramEnd"/>
+      <w:r>
+        <w:rPr>
+          <w:rFonts w:ascii="Arial" w:hAnsi="Arial" w:cs="Arial"/>
+        </w:rPr>
+        <w:t>}</w:t>
       </w:r>
     </w:p>
     <w:p>
@@ -1684,8 +2626,17 @@
           <w:rFonts w:ascii="Arial" w:hAnsi="Arial" w:cs="Arial"/>
           <w:highlight w:val="yellow"/>
         </w:rPr>
-        <w:t>{%p endif %}</w:t>
-      </w:r>
+        <w:t xml:space="preserve">{%p </w:t>
+      </w:r>
+      <w:proofErr w:type="gramStart"/>
+      <w:r>
+        <w:rPr>
+          <w:rFonts w:ascii="Arial" w:hAnsi="Arial" w:cs="Arial"/>
+          <w:highlight w:val="yellow"/>
+        </w:rPr>
+        <w:t>endif %}</w:t>
+      </w:r>
+      <w:proofErr w:type="gramEnd"/>
     </w:p>
     <w:p>
       <w:pPr>
@@ -1707,15 +2658,31 @@
           <w:rFonts w:ascii="Arial" w:hAnsi="Arial" w:cs="Arial"/>
           <w:highlight w:val="yellow"/>
         </w:rPr>
-        <w:t>ss_factor_eight_need</w:t>
-      </w:r>
-      <w:proofErr w:type="spellEnd"/>
-      <w:r>
-        <w:rPr>
-          <w:rFonts w:ascii="Arial" w:hAnsi="Arial" w:cs="Arial"/>
-          <w:highlight w:val="yellow"/>
-        </w:rPr>
-        <w:t xml:space="preserve"> != “” %}</w:t>
+        <w:t>ss_factor_eight_</w:t>
+      </w:r>
+      <w:proofErr w:type="gramStart"/>
+      <w:r>
+        <w:rPr>
+          <w:rFonts w:ascii="Arial" w:hAnsi="Arial" w:cs="Arial"/>
+          <w:highlight w:val="yellow"/>
+        </w:rPr>
+        <w:t>need</w:t>
+      </w:r>
+      <w:proofErr w:type="spellEnd"/>
+      <w:r>
+        <w:rPr>
+          <w:rFonts w:ascii="Arial" w:hAnsi="Arial" w:cs="Arial"/>
+          <w:highlight w:val="yellow"/>
+        </w:rPr>
+        <w:t xml:space="preserve"> !</w:t>
+      </w:r>
+      <w:proofErr w:type="gramEnd"/>
+      <w:r>
+        <w:rPr>
+          <w:rFonts w:ascii="Arial" w:hAnsi="Arial" w:cs="Arial"/>
+          <w:highlight w:val="yellow"/>
+        </w:rPr>
+        <w:t>= “” %}</w:t>
       </w:r>
     </w:p>
     <w:p>
@@ -1752,6 +2719,7 @@
           <w:rFonts w:ascii="Arial" w:hAnsi="Arial" w:cs="Arial"/>
         </w:rPr>
       </w:pPr>
+      <w:proofErr w:type="gramStart"/>
       <w:r>
         <w:rPr>
           <w:rFonts w:ascii="Arial" w:hAnsi="Arial" w:cs="Arial"/>
@@ -1763,14 +2731,35 @@
         <w:rPr>
           <w:rFonts w:ascii="Arial" w:hAnsi="Arial" w:cs="Arial"/>
         </w:rPr>
-        <w:t>ss_factor_eight_need</w:t>
-      </w:r>
-      <w:proofErr w:type="spellEnd"/>
-      <w:r>
-        <w:rPr>
-          <w:rFonts w:ascii="Arial" w:hAnsi="Arial" w:cs="Arial"/>
-        </w:rPr>
-        <w:t xml:space="preserve"> }}</w:t>
+        <w:t>ss</w:t>
+      </w:r>
+      <w:proofErr w:type="gramEnd"/>
+      <w:r>
+        <w:rPr>
+          <w:rFonts w:ascii="Arial" w:hAnsi="Arial" w:cs="Arial"/>
+        </w:rPr>
+        <w:t>_factor_eight_</w:t>
+      </w:r>
+      <w:proofErr w:type="gramStart"/>
+      <w:r>
+        <w:rPr>
+          <w:rFonts w:ascii="Arial" w:hAnsi="Arial" w:cs="Arial"/>
+        </w:rPr>
+        <w:t>need</w:t>
+      </w:r>
+      <w:proofErr w:type="spellEnd"/>
+      <w:r>
+        <w:rPr>
+          <w:rFonts w:ascii="Arial" w:hAnsi="Arial" w:cs="Arial"/>
+        </w:rPr>
+        <w:t xml:space="preserve"> }</w:t>
+      </w:r>
+      <w:proofErr w:type="gramEnd"/>
+      <w:r>
+        <w:rPr>
+          <w:rFonts w:ascii="Arial" w:hAnsi="Arial" w:cs="Arial"/>
+        </w:rPr>
+        <w:t>}</w:t>
       </w:r>
     </w:p>
     <w:p>
@@ -1785,8 +2774,17 @@
           <w:rFonts w:ascii="Arial" w:hAnsi="Arial" w:cs="Arial"/>
           <w:highlight w:val="yellow"/>
         </w:rPr>
-        <w:t>{%p endif %}</w:t>
-      </w:r>
+        <w:t xml:space="preserve">{%p </w:t>
+      </w:r>
+      <w:proofErr w:type="gramStart"/>
+      <w:r>
+        <w:rPr>
+          <w:rFonts w:ascii="Arial" w:hAnsi="Arial" w:cs="Arial"/>
+          <w:highlight w:val="yellow"/>
+        </w:rPr>
+        <w:t>endif %}</w:t>
+      </w:r>
+      <w:proofErr w:type="gramEnd"/>
     </w:p>
     <w:p>
       <w:pPr>
@@ -1808,15 +2806,31 @@
           <w:rFonts w:ascii="Arial" w:hAnsi="Arial" w:cs="Arial"/>
           <w:highlight w:val="yellow"/>
         </w:rPr>
-        <w:t>ss_factor_nine_health</w:t>
-      </w:r>
-      <w:proofErr w:type="spellEnd"/>
-      <w:r>
-        <w:rPr>
-          <w:rFonts w:ascii="Arial" w:hAnsi="Arial" w:cs="Arial"/>
-          <w:highlight w:val="yellow"/>
-        </w:rPr>
-        <w:t xml:space="preserve"> != “” %}</w:t>
+        <w:t>ss_factor_nine_</w:t>
+      </w:r>
+      <w:proofErr w:type="gramStart"/>
+      <w:r>
+        <w:rPr>
+          <w:rFonts w:ascii="Arial" w:hAnsi="Arial" w:cs="Arial"/>
+          <w:highlight w:val="yellow"/>
+        </w:rPr>
+        <w:t>health</w:t>
+      </w:r>
+      <w:proofErr w:type="spellEnd"/>
+      <w:r>
+        <w:rPr>
+          <w:rFonts w:ascii="Arial" w:hAnsi="Arial" w:cs="Arial"/>
+          <w:highlight w:val="yellow"/>
+        </w:rPr>
+        <w:t xml:space="preserve"> !</w:t>
+      </w:r>
+      <w:proofErr w:type="gramEnd"/>
+      <w:r>
+        <w:rPr>
+          <w:rFonts w:ascii="Arial" w:hAnsi="Arial" w:cs="Arial"/>
+          <w:highlight w:val="yellow"/>
+        </w:rPr>
+        <w:t>= “” %}</w:t>
       </w:r>
     </w:p>
     <w:p>
@@ -1853,6 +2867,7 @@
           <w:rFonts w:ascii="Arial" w:hAnsi="Arial" w:cs="Arial"/>
         </w:rPr>
       </w:pPr>
+      <w:proofErr w:type="gramStart"/>
       <w:r>
         <w:rPr>
           <w:rFonts w:ascii="Arial" w:hAnsi="Arial" w:cs="Arial"/>
@@ -1864,14 +2879,35 @@
         <w:rPr>
           <w:rFonts w:ascii="Arial" w:hAnsi="Arial" w:cs="Arial"/>
         </w:rPr>
-        <w:t>ss_factor_nine_health</w:t>
-      </w:r>
-      <w:proofErr w:type="spellEnd"/>
-      <w:r>
-        <w:rPr>
-          <w:rFonts w:ascii="Arial" w:hAnsi="Arial" w:cs="Arial"/>
-        </w:rPr>
-        <w:t xml:space="preserve"> }}</w:t>
+        <w:t>ss</w:t>
+      </w:r>
+      <w:proofErr w:type="gramEnd"/>
+      <w:r>
+        <w:rPr>
+          <w:rFonts w:ascii="Arial" w:hAnsi="Arial" w:cs="Arial"/>
+        </w:rPr>
+        <w:t>_factor_nine_</w:t>
+      </w:r>
+      <w:proofErr w:type="gramStart"/>
+      <w:r>
+        <w:rPr>
+          <w:rFonts w:ascii="Arial" w:hAnsi="Arial" w:cs="Arial"/>
+        </w:rPr>
+        <w:t>health</w:t>
+      </w:r>
+      <w:proofErr w:type="spellEnd"/>
+      <w:r>
+        <w:rPr>
+          <w:rFonts w:ascii="Arial" w:hAnsi="Arial" w:cs="Arial"/>
+        </w:rPr>
+        <w:t xml:space="preserve"> }</w:t>
+      </w:r>
+      <w:proofErr w:type="gramEnd"/>
+      <w:r>
+        <w:rPr>
+          <w:rFonts w:ascii="Arial" w:hAnsi="Arial" w:cs="Arial"/>
+        </w:rPr>
+        <w:t>}</w:t>
       </w:r>
     </w:p>
     <w:p>
@@ -1886,8 +2922,17 @@
           <w:rFonts w:ascii="Arial" w:hAnsi="Arial" w:cs="Arial"/>
           <w:highlight w:val="yellow"/>
         </w:rPr>
-        <w:t>{%p endif %}</w:t>
-      </w:r>
+        <w:t xml:space="preserve">{%p </w:t>
+      </w:r>
+      <w:proofErr w:type="gramStart"/>
+      <w:r>
+        <w:rPr>
+          <w:rFonts w:ascii="Arial" w:hAnsi="Arial" w:cs="Arial"/>
+          <w:highlight w:val="yellow"/>
+        </w:rPr>
+        <w:t>endif %}</w:t>
+      </w:r>
+      <w:proofErr w:type="gramEnd"/>
     </w:p>
     <w:p>
       <w:pPr>
@@ -1909,23 +2954,47 @@
           <w:rFonts w:ascii="Arial" w:hAnsi="Arial" w:cs="Arial"/>
           <w:highlight w:val="yellow"/>
         </w:rPr>
-        <w:t>ss_factor_ten_standards</w:t>
-      </w:r>
-      <w:proofErr w:type="spellEnd"/>
-      <w:r>
-        <w:rPr>
-          <w:rFonts w:ascii="Arial" w:hAnsi="Arial" w:cs="Arial"/>
-          <w:highlight w:val="yellow"/>
-        </w:rPr>
-        <w:t xml:space="preserve"> != “” or </w:t>
-      </w:r>
-      <w:proofErr w:type="spellStart"/>
-      <w:r>
-        <w:rPr>
-          <w:rFonts w:ascii="Arial" w:hAnsi="Arial" w:cs="Arial"/>
-          <w:highlight w:val="yellow"/>
-        </w:rPr>
-        <w:t>ss_factor_ten_resp</w:t>
+        <w:t>ss_factor_ten_</w:t>
+      </w:r>
+      <w:proofErr w:type="gramStart"/>
+      <w:r>
+        <w:rPr>
+          <w:rFonts w:ascii="Arial" w:hAnsi="Arial" w:cs="Arial"/>
+          <w:highlight w:val="yellow"/>
+        </w:rPr>
+        <w:t>standards</w:t>
+      </w:r>
+      <w:proofErr w:type="spellEnd"/>
+      <w:r>
+        <w:rPr>
+          <w:rFonts w:ascii="Arial" w:hAnsi="Arial" w:cs="Arial"/>
+          <w:highlight w:val="yellow"/>
+        </w:rPr>
+        <w:t xml:space="preserve"> !</w:t>
+      </w:r>
+      <w:proofErr w:type="gramEnd"/>
+      <w:r>
+        <w:rPr>
+          <w:rFonts w:ascii="Arial" w:hAnsi="Arial" w:cs="Arial"/>
+          <w:highlight w:val="yellow"/>
+        </w:rPr>
+        <w:t xml:space="preserve">= “” or </w:t>
+      </w:r>
+      <w:proofErr w:type="spellStart"/>
+      <w:r>
+        <w:rPr>
+          <w:rFonts w:ascii="Arial" w:hAnsi="Arial" w:cs="Arial"/>
+          <w:highlight w:val="yellow"/>
+        </w:rPr>
+        <w:t>ss_factor_ten_</w:t>
+      </w:r>
+      <w:proofErr w:type="gramStart"/>
+      <w:r>
+        <w:rPr>
+          <w:rFonts w:ascii="Arial" w:hAnsi="Arial" w:cs="Arial"/>
+          <w:highlight w:val="yellow"/>
+        </w:rPr>
+        <w:t>resp</w:t>
       </w:r>
       <w:r>
         <w:rPr>
@@ -1947,7 +3016,15 @@
           <w:rFonts w:ascii="Arial" w:hAnsi="Arial" w:cs="Arial"/>
           <w:highlight w:val="yellow"/>
         </w:rPr>
-        <w:t xml:space="preserve"> != “” %}</w:t>
+        <w:t xml:space="preserve"> !</w:t>
+      </w:r>
+      <w:proofErr w:type="gramEnd"/>
+      <w:r>
+        <w:rPr>
+          <w:rFonts w:ascii="Arial" w:hAnsi="Arial" w:cs="Arial"/>
+          <w:highlight w:val="yellow"/>
+        </w:rPr>
+        <w:t>= “” %}</w:t>
       </w:r>
     </w:p>
     <w:p>
@@ -1998,15 +3075,31 @@
           <w:rFonts w:ascii="Arial" w:hAnsi="Arial" w:cs="Arial"/>
           <w:highlight w:val="cyan"/>
         </w:rPr>
-        <w:t>ss_factor_ten_standards</w:t>
-      </w:r>
-      <w:proofErr w:type="spellEnd"/>
+        <w:t>ss_factor_ten_</w:t>
+      </w:r>
+      <w:proofErr w:type="gramStart"/>
       <w:r>
         <w:rPr>
           <w:rFonts w:ascii="Arial" w:hAnsi="Arial" w:cs="Arial"/>
           <w:highlight w:val="cyan"/>
         </w:rPr>
-        <w:t xml:space="preserve"> != “” %}</w:t>
+        <w:t>standards</w:t>
+      </w:r>
+      <w:proofErr w:type="spellEnd"/>
+      <w:r>
+        <w:rPr>
+          <w:rFonts w:ascii="Arial" w:hAnsi="Arial" w:cs="Arial"/>
+          <w:highlight w:val="cyan"/>
+        </w:rPr>
+        <w:t xml:space="preserve"> !</w:t>
+      </w:r>
+      <w:proofErr w:type="gramEnd"/>
+      <w:r>
+        <w:rPr>
+          <w:rFonts w:ascii="Arial" w:hAnsi="Arial" w:cs="Arial"/>
+          <w:highlight w:val="cyan"/>
+        </w:rPr>
+        <w:t>= “” %}</w:t>
       </w:r>
     </w:p>
     <w:p>
@@ -2026,21 +3119,49 @@
         <w:rPr>
           <w:rFonts w:ascii="Arial" w:hAnsi="Arial" w:cs="Arial"/>
         </w:rPr>
-        <w:t xml:space="preserve">tandard of living during the marriage: {{ </w:t>
-      </w:r>
-      <w:proofErr w:type="spellStart"/>
-      <w:r>
-        <w:rPr>
-          <w:rFonts w:ascii="Arial" w:hAnsi="Arial" w:cs="Arial"/>
-        </w:rPr>
-        <w:t>ss_factor_ten_standards</w:t>
-      </w:r>
-      <w:proofErr w:type="spellEnd"/>
-      <w:r>
-        <w:rPr>
-          <w:rFonts w:ascii="Arial" w:hAnsi="Arial" w:cs="Arial"/>
-        </w:rPr>
-        <w:t xml:space="preserve"> }}</w:t>
+        <w:t xml:space="preserve">tandard of living during the marriage: </w:t>
+      </w:r>
+      <w:proofErr w:type="gramStart"/>
+      <w:r>
+        <w:rPr>
+          <w:rFonts w:ascii="Arial" w:hAnsi="Arial" w:cs="Arial"/>
+        </w:rPr>
+        <w:t xml:space="preserve">{{ </w:t>
+      </w:r>
+      <w:proofErr w:type="spellStart"/>
+      <w:r>
+        <w:rPr>
+          <w:rFonts w:ascii="Arial" w:hAnsi="Arial" w:cs="Arial"/>
+        </w:rPr>
+        <w:t>ss</w:t>
+      </w:r>
+      <w:proofErr w:type="gramEnd"/>
+      <w:r>
+        <w:rPr>
+          <w:rFonts w:ascii="Arial" w:hAnsi="Arial" w:cs="Arial"/>
+        </w:rPr>
+        <w:t>_factor_ten_</w:t>
+      </w:r>
+      <w:proofErr w:type="gramStart"/>
+      <w:r>
+        <w:rPr>
+          <w:rFonts w:ascii="Arial" w:hAnsi="Arial" w:cs="Arial"/>
+        </w:rPr>
+        <w:t>standards</w:t>
+      </w:r>
+      <w:proofErr w:type="spellEnd"/>
+      <w:r>
+        <w:rPr>
+          <w:rFonts w:ascii="Arial" w:hAnsi="Arial" w:cs="Arial"/>
+        </w:rPr>
+        <w:t xml:space="preserve"> }</w:t>
+      </w:r>
+      <w:proofErr w:type="gramEnd"/>
+      <w:r>
+        <w:rPr>
+          <w:rFonts w:ascii="Arial" w:hAnsi="Arial" w:cs="Arial"/>
+        </w:rPr>
+        <w:t>}</w:t>
       </w:r>
     </w:p>
     <w:p>
@@ -2055,8 +3176,17 @@
           <w:rFonts w:ascii="Arial" w:hAnsi="Arial" w:cs="Arial"/>
           <w:highlight w:val="cyan"/>
         </w:rPr>
-        <w:t>{%p endif %}</w:t>
-      </w:r>
+        <w:t xml:space="preserve">{%p </w:t>
+      </w:r>
+      <w:proofErr w:type="gramStart"/>
+      <w:r>
+        <w:rPr>
+          <w:rFonts w:ascii="Arial" w:hAnsi="Arial" w:cs="Arial"/>
+          <w:highlight w:val="cyan"/>
+        </w:rPr>
+        <w:t>endif %}</w:t>
+      </w:r>
+      <w:proofErr w:type="gramEnd"/>
     </w:p>
     <w:p>
       <w:pPr>
@@ -2078,15 +3208,31 @@
           <w:rFonts w:ascii="Arial" w:hAnsi="Arial" w:cs="Arial"/>
           <w:highlight w:val="cyan"/>
         </w:rPr>
-        <w:t>ss_factor_ten_responsibilities</w:t>
-      </w:r>
-      <w:proofErr w:type="spellEnd"/>
+        <w:t>ss_factor_ten_</w:t>
+      </w:r>
+      <w:proofErr w:type="gramStart"/>
       <w:r>
         <w:rPr>
           <w:rFonts w:ascii="Arial" w:hAnsi="Arial" w:cs="Arial"/>
           <w:highlight w:val="cyan"/>
         </w:rPr>
-        <w:t xml:space="preserve"> != “” %}</w:t>
+        <w:t>responsibilities</w:t>
+      </w:r>
+      <w:proofErr w:type="spellEnd"/>
+      <w:r>
+        <w:rPr>
+          <w:rFonts w:ascii="Arial" w:hAnsi="Arial" w:cs="Arial"/>
+          <w:highlight w:val="cyan"/>
+        </w:rPr>
+        <w:t xml:space="preserve"> !</w:t>
+      </w:r>
+      <w:proofErr w:type="gramEnd"/>
+      <w:r>
+        <w:rPr>
+          <w:rFonts w:ascii="Arial" w:hAnsi="Arial" w:cs="Arial"/>
+          <w:highlight w:val="cyan"/>
+        </w:rPr>
+        <w:t>= “” %}</w:t>
       </w:r>
     </w:p>
     <w:p>
@@ -2106,21 +3252,49 @@
         <w:rPr>
           <w:rFonts w:ascii="Arial" w:hAnsi="Arial" w:cs="Arial"/>
         </w:rPr>
-        <w:t xml:space="preserve"> others: {{ </w:t>
-      </w:r>
-      <w:proofErr w:type="spellStart"/>
-      <w:r>
-        <w:rPr>
-          <w:rFonts w:ascii="Arial" w:hAnsi="Arial" w:cs="Arial"/>
-        </w:rPr>
-        <w:t>ss_factor_ten_responsibilities</w:t>
-      </w:r>
-      <w:proofErr w:type="spellEnd"/>
-      <w:r>
-        <w:rPr>
-          <w:rFonts w:ascii="Arial" w:hAnsi="Arial" w:cs="Arial"/>
-        </w:rPr>
-        <w:t xml:space="preserve"> }}</w:t>
+        <w:t xml:space="preserve"> others: </w:t>
+      </w:r>
+      <w:proofErr w:type="gramStart"/>
+      <w:r>
+        <w:rPr>
+          <w:rFonts w:ascii="Arial" w:hAnsi="Arial" w:cs="Arial"/>
+        </w:rPr>
+        <w:t xml:space="preserve">{{ </w:t>
+      </w:r>
+      <w:proofErr w:type="spellStart"/>
+      <w:r>
+        <w:rPr>
+          <w:rFonts w:ascii="Arial" w:hAnsi="Arial" w:cs="Arial"/>
+        </w:rPr>
+        <w:t>ss</w:t>
+      </w:r>
+      <w:proofErr w:type="gramEnd"/>
+      <w:r>
+        <w:rPr>
+          <w:rFonts w:ascii="Arial" w:hAnsi="Arial" w:cs="Arial"/>
+        </w:rPr>
+        <w:t>_factor_ten_</w:t>
+      </w:r>
+      <w:proofErr w:type="gramStart"/>
+      <w:r>
+        <w:rPr>
+          <w:rFonts w:ascii="Arial" w:hAnsi="Arial" w:cs="Arial"/>
+        </w:rPr>
+        <w:t>responsibilities</w:t>
+      </w:r>
+      <w:proofErr w:type="spellEnd"/>
+      <w:r>
+        <w:rPr>
+          <w:rFonts w:ascii="Arial" w:hAnsi="Arial" w:cs="Arial"/>
+        </w:rPr>
+        <w:t xml:space="preserve"> }</w:t>
+      </w:r>
+      <w:proofErr w:type="gramEnd"/>
+      <w:r>
+        <w:rPr>
+          <w:rFonts w:ascii="Arial" w:hAnsi="Arial" w:cs="Arial"/>
+        </w:rPr>
+        <w:t>}</w:t>
       </w:r>
     </w:p>
     <w:p>
@@ -2135,8 +3309,17 @@
           <w:rFonts w:ascii="Arial" w:hAnsi="Arial" w:cs="Arial"/>
           <w:highlight w:val="cyan"/>
         </w:rPr>
-        <w:t>{%p endif %}</w:t>
-      </w:r>
+        <w:t xml:space="preserve">{%p </w:t>
+      </w:r>
+      <w:proofErr w:type="gramStart"/>
+      <w:r>
+        <w:rPr>
+          <w:rFonts w:ascii="Arial" w:hAnsi="Arial" w:cs="Arial"/>
+          <w:highlight w:val="cyan"/>
+        </w:rPr>
+        <w:t>endif %}</w:t>
+      </w:r>
+      <w:proofErr w:type="gramEnd"/>
     </w:p>
     <w:p>
       <w:pPr>
@@ -2150,8 +3333,17 @@
           <w:rFonts w:ascii="Arial" w:hAnsi="Arial" w:cs="Arial"/>
           <w:highlight w:val="yellow"/>
         </w:rPr>
-        <w:t>{%p endif %}</w:t>
-      </w:r>
+        <w:t xml:space="preserve">{%p </w:t>
+      </w:r>
+      <w:proofErr w:type="gramStart"/>
+      <w:r>
+        <w:rPr>
+          <w:rFonts w:ascii="Arial" w:hAnsi="Arial" w:cs="Arial"/>
+          <w:highlight w:val="yellow"/>
+        </w:rPr>
+        <w:t>endif %}</w:t>
+      </w:r>
+      <w:proofErr w:type="gramEnd"/>
     </w:p>
     <w:p>
       <w:pPr>
@@ -2173,15 +3365,31 @@
           <w:rFonts w:ascii="Arial" w:hAnsi="Arial" w:cs="Arial"/>
           <w:highlight w:val="yellow"/>
         </w:rPr>
-        <w:t>ss_factor_eleven_contributions</w:t>
-      </w:r>
-      <w:proofErr w:type="spellEnd"/>
-      <w:r>
-        <w:rPr>
-          <w:rFonts w:ascii="Arial" w:hAnsi="Arial" w:cs="Arial"/>
-          <w:highlight w:val="yellow"/>
-        </w:rPr>
-        <w:t xml:space="preserve"> != “” %}</w:t>
+        <w:t>ss_factor_eleven_</w:t>
+      </w:r>
+      <w:proofErr w:type="gramStart"/>
+      <w:r>
+        <w:rPr>
+          <w:rFonts w:ascii="Arial" w:hAnsi="Arial" w:cs="Arial"/>
+          <w:highlight w:val="yellow"/>
+        </w:rPr>
+        <w:t>contributions</w:t>
+      </w:r>
+      <w:proofErr w:type="spellEnd"/>
+      <w:r>
+        <w:rPr>
+          <w:rFonts w:ascii="Arial" w:hAnsi="Arial" w:cs="Arial"/>
+          <w:highlight w:val="yellow"/>
+        </w:rPr>
+        <w:t xml:space="preserve"> !</w:t>
+      </w:r>
+      <w:proofErr w:type="gramEnd"/>
+      <w:r>
+        <w:rPr>
+          <w:rFonts w:ascii="Arial" w:hAnsi="Arial" w:cs="Arial"/>
+          <w:highlight w:val="yellow"/>
+        </w:rPr>
+        <w:t>= “” %}</w:t>
       </w:r>
     </w:p>
     <w:p>
@@ -2234,6 +3442,7 @@
           <w:rFonts w:ascii="Arial" w:hAnsi="Arial" w:cs="Arial"/>
         </w:rPr>
       </w:pPr>
+      <w:proofErr w:type="gramStart"/>
       <w:r>
         <w:rPr>
           <w:rFonts w:ascii="Arial" w:hAnsi="Arial" w:cs="Arial"/>
@@ -2245,14 +3454,35 @@
         <w:rPr>
           <w:rFonts w:ascii="Arial" w:hAnsi="Arial" w:cs="Arial"/>
         </w:rPr>
-        <w:t>ss_factor_eleven_contributions</w:t>
-      </w:r>
-      <w:proofErr w:type="spellEnd"/>
-      <w:r>
-        <w:rPr>
-          <w:rFonts w:ascii="Arial" w:hAnsi="Arial" w:cs="Arial"/>
-        </w:rPr>
-        <w:t xml:space="preserve"> }}</w:t>
+        <w:t>ss</w:t>
+      </w:r>
+      <w:proofErr w:type="gramEnd"/>
+      <w:r>
+        <w:rPr>
+          <w:rFonts w:ascii="Arial" w:hAnsi="Arial" w:cs="Arial"/>
+        </w:rPr>
+        <w:t>_factor_eleven_</w:t>
+      </w:r>
+      <w:proofErr w:type="gramStart"/>
+      <w:r>
+        <w:rPr>
+          <w:rFonts w:ascii="Arial" w:hAnsi="Arial" w:cs="Arial"/>
+        </w:rPr>
+        <w:t>contributions</w:t>
+      </w:r>
+      <w:proofErr w:type="spellEnd"/>
+      <w:r>
+        <w:rPr>
+          <w:rFonts w:ascii="Arial" w:hAnsi="Arial" w:cs="Arial"/>
+        </w:rPr>
+        <w:t xml:space="preserve"> }</w:t>
+      </w:r>
+      <w:proofErr w:type="gramEnd"/>
+      <w:r>
+        <w:rPr>
+          <w:rFonts w:ascii="Arial" w:hAnsi="Arial" w:cs="Arial"/>
+        </w:rPr>
+        <w:t>}</w:t>
       </w:r>
     </w:p>
     <w:p>
@@ -2267,8 +3497,18 @@
           <w:rFonts w:ascii="Arial" w:hAnsi="Arial" w:cs="Arial"/>
           <w:highlight w:val="yellow"/>
         </w:rPr>
-        <w:t>{%p endif %}</w:t>
-      </w:r>
+        <w:lastRenderedPageBreak/>
+        <w:t xml:space="preserve">{%p </w:t>
+      </w:r>
+      <w:proofErr w:type="gramStart"/>
+      <w:r>
+        <w:rPr>
+          <w:rFonts w:ascii="Arial" w:hAnsi="Arial" w:cs="Arial"/>
+          <w:highlight w:val="yellow"/>
+        </w:rPr>
+        <w:t>endif %}</w:t>
+      </w:r>
+      <w:proofErr w:type="gramEnd"/>
     </w:p>
     <w:p>
       <w:pPr>
@@ -2290,15 +3530,31 @@
           <w:rFonts w:ascii="Arial" w:hAnsi="Arial" w:cs="Arial"/>
           <w:highlight w:val="yellow"/>
         </w:rPr>
-        <w:t>ss_factor_twelve_fault_redux</w:t>
-      </w:r>
-      <w:proofErr w:type="spellEnd"/>
-      <w:r>
-        <w:rPr>
-          <w:rFonts w:ascii="Arial" w:hAnsi="Arial" w:cs="Arial"/>
-          <w:highlight w:val="yellow"/>
-        </w:rPr>
-        <w:t xml:space="preserve"> != “” %}</w:t>
+        <w:t>ss_factor_twelve_fault_</w:t>
+      </w:r>
+      <w:proofErr w:type="gramStart"/>
+      <w:r>
+        <w:rPr>
+          <w:rFonts w:ascii="Arial" w:hAnsi="Arial" w:cs="Arial"/>
+          <w:highlight w:val="yellow"/>
+        </w:rPr>
+        <w:t>redux</w:t>
+      </w:r>
+      <w:proofErr w:type="spellEnd"/>
+      <w:r>
+        <w:rPr>
+          <w:rFonts w:ascii="Arial" w:hAnsi="Arial" w:cs="Arial"/>
+          <w:highlight w:val="yellow"/>
+        </w:rPr>
+        <w:t xml:space="preserve"> !</w:t>
+      </w:r>
+      <w:proofErr w:type="gramEnd"/>
+      <w:r>
+        <w:rPr>
+          <w:rFonts w:ascii="Arial" w:hAnsi="Arial" w:cs="Arial"/>
+          <w:highlight w:val="yellow"/>
+        </w:rPr>
+        <w:t>= “” %}</w:t>
       </w:r>
     </w:p>
     <w:p>
@@ -2325,8 +3581,25 @@
           <w:b/>
           <w:bCs/>
         </w:rPr>
-        <w:lastRenderedPageBreak/>
-        <w:t>The parties’ fault in causing the divorce:</w:t>
+        <w:t xml:space="preserve">The parties’ fault in causing </w:t>
+      </w:r>
+      <w:proofErr w:type="gramStart"/>
+      <w:r>
+        <w:rPr>
+          <w:rFonts w:ascii="Arial" w:hAnsi="Arial" w:cs="Arial"/>
+          <w:b/>
+          <w:bCs/>
+        </w:rPr>
+        <w:t>the divorce</w:t>
+      </w:r>
+      <w:proofErr w:type="gramEnd"/>
+      <w:r>
+        <w:rPr>
+          <w:rFonts w:ascii="Arial" w:hAnsi="Arial" w:cs="Arial"/>
+          <w:b/>
+          <w:bCs/>
+        </w:rPr>
+        <w:t>:</w:t>
       </w:r>
     </w:p>
     <w:p>
@@ -2336,6 +3609,7 @@
           <w:rFonts w:ascii="Arial" w:hAnsi="Arial" w:cs="Arial"/>
         </w:rPr>
       </w:pPr>
+      <w:proofErr w:type="gramStart"/>
       <w:r>
         <w:rPr>
           <w:rFonts w:ascii="Arial" w:hAnsi="Arial" w:cs="Arial"/>
@@ -2347,14 +3621,35 @@
         <w:rPr>
           <w:rFonts w:ascii="Arial" w:hAnsi="Arial" w:cs="Arial"/>
         </w:rPr>
-        <w:t>ss_factor_twelve_fault_redux</w:t>
-      </w:r>
-      <w:proofErr w:type="spellEnd"/>
-      <w:r>
-        <w:rPr>
-          <w:rFonts w:ascii="Arial" w:hAnsi="Arial" w:cs="Arial"/>
-        </w:rPr>
-        <w:t xml:space="preserve"> }}</w:t>
+        <w:t>ss</w:t>
+      </w:r>
+      <w:proofErr w:type="gramEnd"/>
+      <w:r>
+        <w:rPr>
+          <w:rFonts w:ascii="Arial" w:hAnsi="Arial" w:cs="Arial"/>
+        </w:rPr>
+        <w:t>_factor_twelve_fault_</w:t>
+      </w:r>
+      <w:proofErr w:type="gramStart"/>
+      <w:r>
+        <w:rPr>
+          <w:rFonts w:ascii="Arial" w:hAnsi="Arial" w:cs="Arial"/>
+        </w:rPr>
+        <w:t>redux</w:t>
+      </w:r>
+      <w:proofErr w:type="spellEnd"/>
+      <w:r>
+        <w:rPr>
+          <w:rFonts w:ascii="Arial" w:hAnsi="Arial" w:cs="Arial"/>
+        </w:rPr>
+        <w:t xml:space="preserve"> }</w:t>
+      </w:r>
+      <w:proofErr w:type="gramEnd"/>
+      <w:r>
+        <w:rPr>
+          <w:rFonts w:ascii="Arial" w:hAnsi="Arial" w:cs="Arial"/>
+        </w:rPr>
+        <w:t>}</w:t>
       </w:r>
     </w:p>
     <w:p>
@@ -2369,8 +3664,17 @@
           <w:rFonts w:ascii="Arial" w:hAnsi="Arial" w:cs="Arial"/>
           <w:highlight w:val="yellow"/>
         </w:rPr>
-        <w:t>{%p endif %}</w:t>
-      </w:r>
+        <w:t xml:space="preserve">{%p </w:t>
+      </w:r>
+      <w:proofErr w:type="gramStart"/>
+      <w:r>
+        <w:rPr>
+          <w:rFonts w:ascii="Arial" w:hAnsi="Arial" w:cs="Arial"/>
+          <w:highlight w:val="yellow"/>
+        </w:rPr>
+        <w:t>endif %}</w:t>
+      </w:r>
+      <w:proofErr w:type="gramEnd"/>
     </w:p>
     <w:p>
       <w:pPr>
@@ -2392,15 +3696,31 @@
           <w:rFonts w:ascii="Arial" w:hAnsi="Arial" w:cs="Arial"/>
           <w:highlight w:val="yellow"/>
         </w:rPr>
-        <w:t>ss_factor_thirteen_cohabitation</w:t>
-      </w:r>
-      <w:proofErr w:type="spellEnd"/>
-      <w:r>
-        <w:rPr>
-          <w:rFonts w:ascii="Arial" w:hAnsi="Arial" w:cs="Arial"/>
-          <w:highlight w:val="yellow"/>
-        </w:rPr>
-        <w:t xml:space="preserve"> != “” %}</w:t>
+        <w:t>ss_factor_thirteen_</w:t>
+      </w:r>
+      <w:proofErr w:type="gramStart"/>
+      <w:r>
+        <w:rPr>
+          <w:rFonts w:ascii="Arial" w:hAnsi="Arial" w:cs="Arial"/>
+          <w:highlight w:val="yellow"/>
+        </w:rPr>
+        <w:t>cohabitation</w:t>
+      </w:r>
+      <w:proofErr w:type="spellEnd"/>
+      <w:r>
+        <w:rPr>
+          <w:rFonts w:ascii="Arial" w:hAnsi="Arial" w:cs="Arial"/>
+          <w:highlight w:val="yellow"/>
+        </w:rPr>
+        <w:t xml:space="preserve"> !</w:t>
+      </w:r>
+      <w:proofErr w:type="gramEnd"/>
+      <w:r>
+        <w:rPr>
+          <w:rFonts w:ascii="Arial" w:hAnsi="Arial" w:cs="Arial"/>
+          <w:highlight w:val="yellow"/>
+        </w:rPr>
+        <w:t>= “” %}</w:t>
       </w:r>
     </w:p>
     <w:p>
@@ -2437,6 +3757,7 @@
           <w:rFonts w:ascii="Arial" w:hAnsi="Arial" w:cs="Arial"/>
         </w:rPr>
       </w:pPr>
+      <w:proofErr w:type="gramStart"/>
       <w:r>
         <w:rPr>
           <w:rFonts w:ascii="Arial" w:hAnsi="Arial" w:cs="Arial"/>
@@ -2448,14 +3769,35 @@
         <w:rPr>
           <w:rFonts w:ascii="Arial" w:hAnsi="Arial" w:cs="Arial"/>
         </w:rPr>
-        <w:t>ss_factor_thirteen_cohabitation</w:t>
-      </w:r>
-      <w:proofErr w:type="spellEnd"/>
-      <w:r>
-        <w:rPr>
-          <w:rFonts w:ascii="Arial" w:hAnsi="Arial" w:cs="Arial"/>
-        </w:rPr>
-        <w:t xml:space="preserve"> }}</w:t>
+        <w:t>ss</w:t>
+      </w:r>
+      <w:proofErr w:type="gramEnd"/>
+      <w:r>
+        <w:rPr>
+          <w:rFonts w:ascii="Arial" w:hAnsi="Arial" w:cs="Arial"/>
+        </w:rPr>
+        <w:t>_factor_thirteen_</w:t>
+      </w:r>
+      <w:proofErr w:type="gramStart"/>
+      <w:r>
+        <w:rPr>
+          <w:rFonts w:ascii="Arial" w:hAnsi="Arial" w:cs="Arial"/>
+        </w:rPr>
+        <w:t>cohabitation</w:t>
+      </w:r>
+      <w:proofErr w:type="spellEnd"/>
+      <w:r>
+        <w:rPr>
+          <w:rFonts w:ascii="Arial" w:hAnsi="Arial" w:cs="Arial"/>
+        </w:rPr>
+        <w:t xml:space="preserve"> }</w:t>
+      </w:r>
+      <w:proofErr w:type="gramEnd"/>
+      <w:r>
+        <w:rPr>
+          <w:rFonts w:ascii="Arial" w:hAnsi="Arial" w:cs="Arial"/>
+        </w:rPr>
+        <w:t>}</w:t>
       </w:r>
     </w:p>
     <w:p>
@@ -2470,8 +3812,17 @@
           <w:rFonts w:ascii="Arial" w:hAnsi="Arial" w:cs="Arial"/>
           <w:highlight w:val="yellow"/>
         </w:rPr>
-        <w:t>{%p endif %}</w:t>
-      </w:r>
+        <w:t xml:space="preserve">{%p </w:t>
+      </w:r>
+      <w:proofErr w:type="gramStart"/>
+      <w:r>
+        <w:rPr>
+          <w:rFonts w:ascii="Arial" w:hAnsi="Arial" w:cs="Arial"/>
+          <w:highlight w:val="yellow"/>
+        </w:rPr>
+        <w:t>endif %}</w:t>
+      </w:r>
+      <w:proofErr w:type="gramEnd"/>
     </w:p>
     <w:p>
       <w:pPr>
@@ -2493,15 +3844,31 @@
           <w:rFonts w:ascii="Arial" w:hAnsi="Arial" w:cs="Arial"/>
           <w:highlight w:val="yellow"/>
         </w:rPr>
-        <w:t>ss_factor_fourteen_equity</w:t>
-      </w:r>
-      <w:proofErr w:type="spellEnd"/>
-      <w:r>
-        <w:rPr>
-          <w:rFonts w:ascii="Arial" w:hAnsi="Arial" w:cs="Arial"/>
-          <w:highlight w:val="yellow"/>
-        </w:rPr>
-        <w:t xml:space="preserve"> != “” %}</w:t>
+        <w:t>ss_factor_fourteen_</w:t>
+      </w:r>
+      <w:proofErr w:type="gramStart"/>
+      <w:r>
+        <w:rPr>
+          <w:rFonts w:ascii="Arial" w:hAnsi="Arial" w:cs="Arial"/>
+          <w:highlight w:val="yellow"/>
+        </w:rPr>
+        <w:t>equity</w:t>
+      </w:r>
+      <w:proofErr w:type="spellEnd"/>
+      <w:r>
+        <w:rPr>
+          <w:rFonts w:ascii="Arial" w:hAnsi="Arial" w:cs="Arial"/>
+          <w:highlight w:val="yellow"/>
+        </w:rPr>
+        <w:t xml:space="preserve"> !</w:t>
+      </w:r>
+      <w:proofErr w:type="gramEnd"/>
+      <w:r>
+        <w:rPr>
+          <w:rFonts w:ascii="Arial" w:hAnsi="Arial" w:cs="Arial"/>
+          <w:highlight w:val="yellow"/>
+        </w:rPr>
+        <w:t>= “” %}</w:t>
       </w:r>
     </w:p>
     <w:p>
@@ -2538,6 +3905,7 @@
           <w:rFonts w:ascii="Arial" w:hAnsi="Arial" w:cs="Arial"/>
         </w:rPr>
       </w:pPr>
+      <w:proofErr w:type="gramStart"/>
       <w:r>
         <w:rPr>
           <w:rFonts w:ascii="Arial" w:hAnsi="Arial" w:cs="Arial"/>
@@ -2549,14 +3917,35 @@
         <w:rPr>
           <w:rFonts w:ascii="Arial" w:hAnsi="Arial" w:cs="Arial"/>
         </w:rPr>
-        <w:t>ss_factor_fourteen_equity</w:t>
-      </w:r>
-      <w:proofErr w:type="spellEnd"/>
-      <w:r>
-        <w:rPr>
-          <w:rFonts w:ascii="Arial" w:hAnsi="Arial" w:cs="Arial"/>
-        </w:rPr>
-        <w:t xml:space="preserve"> }}</w:t>
+        <w:t>ss</w:t>
+      </w:r>
+      <w:proofErr w:type="gramEnd"/>
+      <w:r>
+        <w:rPr>
+          <w:rFonts w:ascii="Arial" w:hAnsi="Arial" w:cs="Arial"/>
+        </w:rPr>
+        <w:t>_factor_fourteen_</w:t>
+      </w:r>
+      <w:proofErr w:type="gramStart"/>
+      <w:r>
+        <w:rPr>
+          <w:rFonts w:ascii="Arial" w:hAnsi="Arial" w:cs="Arial"/>
+        </w:rPr>
+        <w:t>equity</w:t>
+      </w:r>
+      <w:proofErr w:type="spellEnd"/>
+      <w:r>
+        <w:rPr>
+          <w:rFonts w:ascii="Arial" w:hAnsi="Arial" w:cs="Arial"/>
+        </w:rPr>
+        <w:t xml:space="preserve"> }</w:t>
+      </w:r>
+      <w:proofErr w:type="gramEnd"/>
+      <w:r>
+        <w:rPr>
+          <w:rFonts w:ascii="Arial" w:hAnsi="Arial" w:cs="Arial"/>
+        </w:rPr>
+        <w:t>}</w:t>
       </w:r>
     </w:p>
     <w:p>
@@ -2571,8 +3960,17 @@
           <w:rFonts w:ascii="Arial" w:hAnsi="Arial" w:cs="Arial"/>
           <w:highlight w:val="yellow"/>
         </w:rPr>
-        <w:t>{%p endif %}</w:t>
-      </w:r>
+        <w:t xml:space="preserve">{%p </w:t>
+      </w:r>
+      <w:proofErr w:type="gramStart"/>
+      <w:r>
+        <w:rPr>
+          <w:rFonts w:ascii="Arial" w:hAnsi="Arial" w:cs="Arial"/>
+          <w:highlight w:val="yellow"/>
+        </w:rPr>
+        <w:t>endif %}</w:t>
+      </w:r>
+      <w:proofErr w:type="gramEnd"/>
     </w:p>
     <w:p>
       <w:pPr>
@@ -2585,8 +3983,16 @@
         <w:rPr>
           <w:rFonts w:ascii="Arial" w:hAnsi="Arial" w:cs="Arial"/>
         </w:rPr>
-        <w:t>{%p endif %}</w:t>
-      </w:r>
+        <w:t xml:space="preserve">{%p </w:t>
+      </w:r>
+      <w:proofErr w:type="gramStart"/>
+      <w:r>
+        <w:rPr>
+          <w:rFonts w:ascii="Arial" w:hAnsi="Arial" w:cs="Arial"/>
+        </w:rPr>
+        <w:t>endif %}</w:t>
+      </w:r>
+      <w:proofErr w:type="gramEnd"/>
     </w:p>
     <w:sectPr>
       <w:footerReference w:type="default" r:id="rId7"/>
@@ -2744,7 +4150,16 @@
         <w:sz w:val="20"/>
         <w:szCs w:val="20"/>
       </w:rPr>
-      <w:t xml:space="preserve"> %}C</w:t>
+      <w:t xml:space="preserve"> </w:t>
+    </w:r>
+    <w:proofErr w:type="gramStart"/>
+    <w:r>
+      <w:rPr>
+        <w:rFonts w:ascii="Arial" w:hAnsi="Arial" w:cs="Arial"/>
+        <w:sz w:val="20"/>
+        <w:szCs w:val="20"/>
+      </w:rPr>
+      <w:t>%}C</w:t>
     </w:r>
     <w:r>
       <w:rPr>
@@ -2754,6 +4169,7 @@
       </w:rPr>
       <w:t>omplaint</w:t>
     </w:r>
+    <w:proofErr w:type="gramEnd"/>
     <w:r>
       <w:rPr>
         <w:rFonts w:ascii="Arial" w:hAnsi="Arial" w:cs="Arial"/>
@@ -2814,7 +4230,16 @@
         <w:sz w:val="20"/>
         <w:szCs w:val="20"/>
       </w:rPr>
-      <w:t>” %}</w:t>
+      <w:t xml:space="preserve">” </w:t>
+    </w:r>
+    <w:proofErr w:type="gramStart"/>
+    <w:r>
+      <w:rPr>
+        <w:rFonts w:ascii="Arial" w:hAnsi="Arial" w:cs="Arial"/>
+        <w:sz w:val="20"/>
+        <w:szCs w:val="20"/>
+      </w:rPr>
+      <w:t>%}</w:t>
     </w:r>
     <w:r>
       <w:rPr>
@@ -2824,6 +4249,7 @@
       </w:rPr>
       <w:t>Counterclaim</w:t>
     </w:r>
+    <w:proofErr w:type="gramEnd"/>
     <w:r>
       <w:rPr>
         <w:rFonts w:ascii="Arial" w:hAnsi="Arial" w:cs="Arial"/>
@@ -2976,8 +4402,18 @@
         <w:sz w:val="20"/>
         <w:szCs w:val="20"/>
       </w:rPr>
-      <w:t>{% if tool_ID == “divorce_complaint</w:t>
+      <w:t>{% if tool_ID == “</w:t>
     </w:r>
+    <w:proofErr w:type="spellStart"/>
+    <w:r>
+      <w:rPr>
+        <w:rFonts w:ascii="Arial" w:hAnsi="Arial" w:cs="Arial"/>
+        <w:sz w:val="20"/>
+        <w:szCs w:val="20"/>
+      </w:rPr>
+      <w:t>divorce_complaint</w:t>
+    </w:r>
+    <w:proofErr w:type="spellEnd"/>
     <w:r>
       <w:rPr>
         <w:rFonts w:ascii="Arial" w:hAnsi="Arial" w:cs="Arial"/>
@@ -2992,7 +4428,16 @@
         <w:sz w:val="20"/>
         <w:szCs w:val="20"/>
       </w:rPr>
-      <w:t xml:space="preserve"> %}</w:t>
+      <w:t xml:space="preserve"> </w:t>
+    </w:r>
+    <w:proofErr w:type="gramStart"/>
+    <w:r>
+      <w:rPr>
+        <w:rFonts w:ascii="Arial" w:hAnsi="Arial" w:cs="Arial"/>
+        <w:sz w:val="20"/>
+        <w:szCs w:val="20"/>
+      </w:rPr>
+      <w:t>%}</w:t>
     </w:r>
     <w:r>
       <w:rPr>
@@ -3002,6 +4447,7 @@
       </w:rPr>
       <w:t>Complaint</w:t>
     </w:r>
+    <w:proofErr w:type="gramEnd"/>
     <w:r>
       <w:rPr>
         <w:rFonts w:ascii="Arial" w:hAnsi="Arial" w:cs="Arial"/>
@@ -3062,7 +4508,16 @@
         <w:sz w:val="20"/>
         <w:szCs w:val="20"/>
       </w:rPr>
-      <w:t>” %}</w:t>
+      <w:t xml:space="preserve">” </w:t>
+    </w:r>
+    <w:proofErr w:type="gramStart"/>
+    <w:r>
+      <w:rPr>
+        <w:rFonts w:ascii="Arial" w:hAnsi="Arial" w:cs="Arial"/>
+        <w:sz w:val="20"/>
+        <w:szCs w:val="20"/>
+      </w:rPr>
+      <w:t>%}</w:t>
     </w:r>
     <w:r>
       <w:rPr>
@@ -3072,6 +4527,7 @@
       </w:rPr>
       <w:t>Counterclaim</w:t>
     </w:r>
+    <w:proofErr w:type="gramEnd"/>
     <w:r>
       <w:rPr>
         <w:rFonts w:ascii="Arial" w:hAnsi="Arial" w:cs="Arial"/>
@@ -3239,6 +4695,7 @@
               <w:szCs w:val="20"/>
             </w:rPr>
           </w:pPr>
+          <w:proofErr w:type="gramStart"/>
           <w:r>
             <w:rPr>
               <w:b/>
@@ -3257,9 +4714,30 @@
               <w:sz w:val="20"/>
               <w:szCs w:val="20"/>
             </w:rPr>
-            <w:t>the_court.number</w:t>
+            <w:t>the</w:t>
+          </w:r>
+          <w:proofErr w:type="gramEnd"/>
+          <w:r>
+            <w:rPr>
+              <w:b/>
+              <w:bCs/>
+              <w:sz w:val="20"/>
+              <w:szCs w:val="20"/>
+            </w:rPr>
+            <w:t>_</w:t>
+          </w:r>
+          <w:proofErr w:type="gramStart"/>
+          <w:r>
+            <w:rPr>
+              <w:b/>
+              <w:bCs/>
+              <w:sz w:val="20"/>
+              <w:szCs w:val="20"/>
+            </w:rPr>
+            <w:t>court.number</w:t>
           </w:r>
           <w:proofErr w:type="spellEnd"/>
+          <w:proofErr w:type="gramEnd"/>
           <w:r>
             <w:rPr>
               <w:b/>
@@ -3291,6 +4769,7 @@
               <w:szCs w:val="20"/>
             </w:rPr>
           </w:pPr>
+          <w:proofErr w:type="gramStart"/>
           <w:r>
             <w:rPr>
               <w:b/>
@@ -3309,9 +4788,30 @@
               <w:sz w:val="20"/>
               <w:szCs w:val="20"/>
             </w:rPr>
-            <w:t>county_choice.upper</w:t>
+            <w:t>county</w:t>
+          </w:r>
+          <w:proofErr w:type="gramEnd"/>
+          <w:r>
+            <w:rPr>
+              <w:b/>
+              <w:bCs/>
+              <w:sz w:val="20"/>
+              <w:szCs w:val="20"/>
+            </w:rPr>
+            <w:t>_</w:t>
+          </w:r>
+          <w:proofErr w:type="gramStart"/>
+          <w:r>
+            <w:rPr>
+              <w:b/>
+              <w:bCs/>
+              <w:sz w:val="20"/>
+              <w:szCs w:val="20"/>
+            </w:rPr>
+            <w:t>choice.upper</w:t>
           </w:r>
           <w:proofErr w:type="spellEnd"/>
+          <w:proofErr w:type="gramEnd"/>
           <w:r>
             <w:rPr>
               <w:b/>
@@ -3319,7 +4819,17 @@
               <w:sz w:val="20"/>
               <w:szCs w:val="20"/>
             </w:rPr>
-            <w:t>()</w:t>
+            <w:t>(</w:t>
+          </w:r>
+          <w:proofErr w:type="gramStart"/>
+          <w:r>
+            <w:rPr>
+              <w:b/>
+              <w:bCs/>
+              <w:sz w:val="20"/>
+              <w:szCs w:val="20"/>
+            </w:rPr>
+            <w:t>)</w:t>
           </w:r>
           <w:r>
             <w:rPr>
@@ -3329,7 +4839,18 @@
               <w:sz w:val="20"/>
               <w:szCs w:val="20"/>
             </w:rPr>
-            <w:t xml:space="preserve"> }} </w:t>
+            <w:t xml:space="preserve"> }</w:t>
+          </w:r>
+          <w:proofErr w:type="gramEnd"/>
+          <w:r>
+            <w:rPr>
+              <w:b/>
+              <w:bCs/>
+              <w:caps/>
+              <w:sz w:val="20"/>
+              <w:szCs w:val="20"/>
+            </w:rPr>
+            <w:t xml:space="preserve">} </w:t>
           </w:r>
           <w:r>
             <w:rPr>
@@ -3397,7 +4918,47 @@
               <w:sz w:val="20"/>
               <w:szCs w:val="20"/>
             </w:rPr>
-            <w:t>{% if tool_ID == “divorce_complaint” %}</w:t>
+            <w:t xml:space="preserve">{% if </w:t>
+          </w:r>
+          <w:proofErr w:type="spellStart"/>
+          <w:r>
+            <w:rPr>
+              <w:sz w:val="20"/>
+              <w:szCs w:val="20"/>
+            </w:rPr>
+            <w:t>tool_ID</w:t>
+          </w:r>
+          <w:proofErr w:type="spellEnd"/>
+          <w:r>
+            <w:rPr>
+              <w:sz w:val="20"/>
+              <w:szCs w:val="20"/>
+            </w:rPr>
+            <w:t xml:space="preserve"> == “</w:t>
+          </w:r>
+          <w:proofErr w:type="spellStart"/>
+          <w:r>
+            <w:rPr>
+              <w:sz w:val="20"/>
+              <w:szCs w:val="20"/>
+            </w:rPr>
+            <w:t>divorce_complaint</w:t>
+          </w:r>
+          <w:proofErr w:type="spellEnd"/>
+          <w:r>
+            <w:rPr>
+              <w:sz w:val="20"/>
+              <w:szCs w:val="20"/>
+            </w:rPr>
+            <w:t xml:space="preserve">” </w:t>
+          </w:r>
+          <w:proofErr w:type="gramStart"/>
+          <w:r>
+            <w:rPr>
+              <w:sz w:val="20"/>
+              <w:szCs w:val="20"/>
+            </w:rPr>
+            <w:t>%}</w:t>
           </w:r>
           <w:r>
             <w:rPr>
@@ -3408,31 +4969,11 @@
             </w:rPr>
             <w:t>COMPLAINT</w:t>
           </w:r>
-          <w:r>
-            <w:rPr>
-              <w:sz w:val="20"/>
-              <w:szCs w:val="20"/>
-            </w:rPr>
-            <w:t>{% elif tool_ID == “divorce_answer” %}</w:t>
-          </w:r>
+          <w:proofErr w:type="gramEnd"/>
           <w:r>
             <w:rPr>
               <w:b/>
               <w:bCs/>
-              <w:sz w:val="20"/>
-              <w:szCs w:val="20"/>
-            </w:rPr>
-            <w:t>COUNTERCLAIM</w:t>
-          </w:r>
-          <w:r>
-            <w:rPr>
-              <w:sz w:val="20"/>
-              <w:szCs w:val="20"/>
-            </w:rPr>
-            <w:t>{% endif %}</w:t>
-          </w:r>
-          <w:r>
-            <w:rPr>
               <w:sz w:val="20"/>
               <w:szCs w:val="20"/>
             </w:rPr>
@@ -3446,6 +4987,207 @@
               <w:szCs w:val="20"/>
             </w:rPr>
             <w:t>FOR DIVORCE</w:t>
+          </w:r>
+          <w:r>
+            <w:rPr>
+              <w:sz w:val="20"/>
+              <w:szCs w:val="20"/>
+            </w:rPr>
+            <w:t xml:space="preserve"> </w:t>
+          </w:r>
+          <w:r>
+            <w:rPr>
+              <w:sz w:val="20"/>
+              <w:szCs w:val="20"/>
+            </w:rPr>
+            <w:t xml:space="preserve">{% </w:t>
+          </w:r>
+          <w:proofErr w:type="spellStart"/>
+          <w:r>
+            <w:rPr>
+              <w:sz w:val="20"/>
+              <w:szCs w:val="20"/>
+            </w:rPr>
+            <w:t>elif</w:t>
+          </w:r>
+          <w:proofErr w:type="spellEnd"/>
+          <w:r>
+            <w:rPr>
+              <w:sz w:val="20"/>
+              <w:szCs w:val="20"/>
+            </w:rPr>
+            <w:t xml:space="preserve"> </w:t>
+          </w:r>
+          <w:proofErr w:type="spellStart"/>
+          <w:r>
+            <w:rPr>
+              <w:sz w:val="20"/>
+              <w:szCs w:val="20"/>
+            </w:rPr>
+            <w:t>tool_ID</w:t>
+          </w:r>
+          <w:proofErr w:type="spellEnd"/>
+          <w:r>
+            <w:rPr>
+              <w:sz w:val="20"/>
+              <w:szCs w:val="20"/>
+            </w:rPr>
+            <w:t xml:space="preserve"> == “</w:t>
+          </w:r>
+          <w:proofErr w:type="spellStart"/>
+          <w:r>
+            <w:rPr>
+              <w:sz w:val="20"/>
+              <w:szCs w:val="20"/>
+            </w:rPr>
+            <w:t>divorce_answer</w:t>
+          </w:r>
+          <w:proofErr w:type="spellEnd"/>
+          <w:r>
+            <w:rPr>
+              <w:sz w:val="20"/>
+              <w:szCs w:val="20"/>
+            </w:rPr>
+            <w:t xml:space="preserve">” </w:t>
+          </w:r>
+          <w:proofErr w:type="gramStart"/>
+          <w:r>
+            <w:rPr>
+              <w:sz w:val="20"/>
+              <w:szCs w:val="20"/>
+            </w:rPr>
+            <w:t>%}</w:t>
+          </w:r>
+          <w:r>
+            <w:rPr>
+              <w:b/>
+              <w:bCs/>
+              <w:sz w:val="20"/>
+              <w:szCs w:val="20"/>
+            </w:rPr>
+            <w:t>COUNTERCLAIM</w:t>
+          </w:r>
+          <w:proofErr w:type="gramEnd"/>
+          <w:r>
+            <w:rPr>
+              <w:b/>
+              <w:bCs/>
+              <w:sz w:val="20"/>
+              <w:szCs w:val="20"/>
+            </w:rPr>
+            <w:t xml:space="preserve"> </w:t>
+          </w:r>
+          <w:r>
+            <w:rPr>
+              <w:b/>
+              <w:bCs/>
+              <w:sz w:val="20"/>
+              <w:szCs w:val="20"/>
+            </w:rPr>
+            <w:t>FOR DIVORCE</w:t>
+          </w:r>
+          <w:r>
+            <w:rPr>
+              <w:sz w:val="20"/>
+              <w:szCs w:val="20"/>
+            </w:rPr>
+            <w:t xml:space="preserve"> </w:t>
+          </w:r>
+          <w:r>
+            <w:rPr>
+              <w:sz w:val="20"/>
+              <w:szCs w:val="20"/>
+            </w:rPr>
+            <w:t xml:space="preserve">{% </w:t>
+          </w:r>
+          <w:proofErr w:type="spellStart"/>
+          <w:r>
+            <w:rPr>
+              <w:sz w:val="20"/>
+              <w:szCs w:val="20"/>
+            </w:rPr>
+            <w:t>elif</w:t>
+          </w:r>
+          <w:proofErr w:type="spellEnd"/>
+          <w:r>
+            <w:rPr>
+              <w:sz w:val="20"/>
+              <w:szCs w:val="20"/>
+            </w:rPr>
+            <w:t xml:space="preserve"> </w:t>
+          </w:r>
+          <w:proofErr w:type="spellStart"/>
+          <w:r>
+            <w:rPr>
+              <w:sz w:val="20"/>
+              <w:szCs w:val="20"/>
+            </w:rPr>
+            <w:t>tool_ID</w:t>
+          </w:r>
+          <w:proofErr w:type="spellEnd"/>
+          <w:r>
+            <w:rPr>
+              <w:sz w:val="20"/>
+              <w:szCs w:val="20"/>
+            </w:rPr>
+            <w:t xml:space="preserve"> == “</w:t>
+          </w:r>
+          <w:proofErr w:type="spellStart"/>
+          <w:r>
+            <w:rPr>
+              <w:sz w:val="20"/>
+              <w:szCs w:val="20"/>
+            </w:rPr>
+            <w:t>custody_complaint</w:t>
+          </w:r>
+          <w:proofErr w:type="spellEnd"/>
+          <w:r>
+            <w:rPr>
+              <w:sz w:val="20"/>
+              <w:szCs w:val="20"/>
+            </w:rPr>
+            <w:t xml:space="preserve">” </w:t>
+          </w:r>
+          <w:proofErr w:type="gramStart"/>
+          <w:r>
+            <w:rPr>
+              <w:sz w:val="20"/>
+              <w:szCs w:val="20"/>
+            </w:rPr>
+            <w:t>%}</w:t>
+          </w:r>
+          <w:r>
+            <w:rPr>
+              <w:b/>
+              <w:bCs/>
+              <w:sz w:val="20"/>
+              <w:szCs w:val="20"/>
+            </w:rPr>
+            <w:t>COMPLAINT</w:t>
+          </w:r>
+          <w:proofErr w:type="gramEnd"/>
+          <w:r>
+            <w:rPr>
+              <w:b/>
+              <w:bCs/>
+              <w:sz w:val="20"/>
+              <w:szCs w:val="20"/>
+            </w:rPr>
+            <w:t xml:space="preserve"> FOR CUSTODY</w:t>
+          </w:r>
+          <w:r>
+            <w:rPr>
+              <w:sz w:val="20"/>
+              <w:szCs w:val="20"/>
+            </w:rPr>
+            <w:t xml:space="preserve"> </w:t>
+          </w:r>
+          <w:r>
+            <w:rPr>
+              <w:sz w:val="20"/>
+              <w:szCs w:val="20"/>
+            </w:rPr>
+            <w:t>{% endif %}</w:t>
           </w:r>
         </w:p>
       </w:tc>
@@ -3491,6 +5233,7 @@
               <w:szCs w:val="20"/>
             </w:rPr>
           </w:pPr>
+          <w:proofErr w:type="gramStart"/>
           <w:r>
             <w:rPr>
               <w:b/>
@@ -3508,7 +5251,17 @@
               <w:sz w:val="20"/>
               <w:szCs w:val="20"/>
             </w:rPr>
-            <w:t>docket_number</w:t>
+            <w:t>docket</w:t>
+          </w:r>
+          <w:proofErr w:type="gramEnd"/>
+          <w:r>
+            <w:rPr>
+              <w:b/>
+              <w:bCs/>
+              <w:sz w:val="20"/>
+              <w:szCs w:val="20"/>
+            </w:rPr>
+            <w:t>_number</w:t>
           </w:r>
           <w:proofErr w:type="spellEnd"/>
           <w:r>

</xml_diff>